<commit_message>
upd: add 3 and 4 labs
</commit_message>
<xml_diff>
--- a/public/Отчет_лабораторная_работа_1.docx
+++ b/public/Отчет_лабораторная_работа_1.docx
@@ -1,6 +1,6 @@
 
 <file path=word/document.xml><?xml version="1.0" encoding="utf-8"?>
-<w:document xmlns:wpc="http://schemas.microsoft.com/office/word/2010/wordprocessingCanvas" xmlns:cx="http://schemas.microsoft.com/office/drawing/2014/chartex" xmlns:cx1="http://schemas.microsoft.com/office/drawing/2015/9/8/chartex" xmlns:cx2="http://schemas.microsoft.com/office/drawing/2015/10/21/chartex" xmlns:cx3="http://schemas.microsoft.com/office/drawing/2016/5/9/chartex" xmlns:cx4="http://schemas.microsoft.com/office/drawing/2016/5/10/chartex" xmlns:cx5="http://schemas.microsoft.com/office/drawing/2016/5/11/chartex" xmlns:cx6="http://schemas.microsoft.com/office/drawing/2016/5/12/chartex" xmlns:cx7="http://schemas.microsoft.com/office/drawing/2016/5/13/chartex" xmlns:cx8="http://schemas.microsoft.com/office/drawing/2016/5/14/chartex" xmlns:mc="http://schemas.openxmlformats.org/markup-compatibility/2006" xmlns:aink="http://schemas.microsoft.com/office/drawing/2016/ink" xmlns:am3d="http://schemas.microsoft.com/office/drawing/2017/model3d" xmlns:o="urn:schemas-microsoft-com:office:office" xmlns:oel="http://schemas.microsoft.com/office/2019/extlst" xmlns:r="http://schemas.openxmlformats.org/officeDocument/2006/relationships" xmlns:m="http://schemas.openxmlformats.org/officeDocument/2006/math" xmlns:v="urn:schemas-microsoft-com:vml" xmlns:wp14="http://schemas.microsoft.com/office/word/2010/wordprocessingDrawing" xmlns:wp="http://schemas.openxmlformats.org/drawingml/2006/wordprocessingDrawing" xmlns:w10="urn:schemas-microsoft-com:office:word" xmlns:w="http://schemas.openxmlformats.org/wordprocessingml/2006/main" xmlns:w14="http://schemas.microsoft.com/office/word/2010/wordml" xmlns:w15="http://schemas.microsoft.com/office/word/2012/wordml" xmlns:w16cex="http://schemas.microsoft.com/office/word/2018/wordml/cex" xmlns:w16cid="http://schemas.microsoft.com/office/word/2016/wordml/cid" xmlns:w16="http://schemas.microsoft.com/office/word/2018/wordml" xmlns:w16sdtdh="http://schemas.microsoft.com/office/word/2020/wordml/sdtdatahash" xmlns:w16se="http://schemas.microsoft.com/office/word/2015/wordml/symex" xmlns:wpg="http://schemas.microsoft.com/office/word/2010/wordprocessingGroup" xmlns:wpi="http://schemas.microsoft.com/office/word/2010/wordprocessingInk" xmlns:wne="http://schemas.microsoft.com/office/word/2006/wordml" xmlns:wps="http://schemas.microsoft.com/office/word/2010/wordprocessingShape" mc:Ignorable="w14 w15 w16se w16cid w16 w16cex w16sdtdh wp14">
+<w:document xmlns:wpc="http://schemas.microsoft.com/office/word/2010/wordprocessingCanvas" xmlns:cx="http://schemas.microsoft.com/office/drawing/2014/chartex" xmlns:cx1="http://schemas.microsoft.com/office/drawing/2015/9/8/chartex" xmlns:cx2="http://schemas.microsoft.com/office/drawing/2015/10/21/chartex" xmlns:cx3="http://schemas.microsoft.com/office/drawing/2016/5/9/chartex" xmlns:cx4="http://schemas.microsoft.com/office/drawing/2016/5/10/chartex" xmlns:cx5="http://schemas.microsoft.com/office/drawing/2016/5/11/chartex" xmlns:cx6="http://schemas.microsoft.com/office/drawing/2016/5/12/chartex" xmlns:cx7="http://schemas.microsoft.com/office/drawing/2016/5/13/chartex" xmlns:cx8="http://schemas.microsoft.com/office/drawing/2016/5/14/chartex" xmlns:mc="http://schemas.openxmlformats.org/markup-compatibility/2006" xmlns:aink="http://schemas.microsoft.com/office/drawing/2016/ink" xmlns:am3d="http://schemas.microsoft.com/office/drawing/2017/model3d" xmlns:o="urn:schemas-microsoft-com:office:office" xmlns:r="http://schemas.openxmlformats.org/officeDocument/2006/relationships" xmlns:m="http://schemas.openxmlformats.org/officeDocument/2006/math" xmlns:v="urn:schemas-microsoft-com:vml" xmlns:wp14="http://schemas.microsoft.com/office/word/2010/wordprocessingDrawing" xmlns:wp="http://schemas.openxmlformats.org/drawingml/2006/wordprocessingDrawing" xmlns:w10="urn:schemas-microsoft-com:office:word" xmlns:w="http://schemas.openxmlformats.org/wordprocessingml/2006/main" xmlns:w14="http://schemas.microsoft.com/office/word/2010/wordml" xmlns:w15="http://schemas.microsoft.com/office/word/2012/wordml" xmlns:w16cex="http://schemas.microsoft.com/office/word/2018/wordml/cex" xmlns:w16cid="http://schemas.microsoft.com/office/word/2016/wordml/cid" xmlns:w16="http://schemas.microsoft.com/office/word/2018/wordml" xmlns:w16sdtdh="http://schemas.microsoft.com/office/word/2020/wordml/sdtdatahash" xmlns:w16se="http://schemas.microsoft.com/office/word/2015/wordml/symex" xmlns:wpg="http://schemas.microsoft.com/office/word/2010/wordprocessingGroup" xmlns:wpi="http://schemas.microsoft.com/office/word/2010/wordprocessingInk" xmlns:wne="http://schemas.microsoft.com/office/word/2006/wordml" xmlns:wps="http://schemas.microsoft.com/office/word/2010/wordprocessingShape" mc:Ignorable="w14 w15 w16se w16cid w16 w16cex w16sdtdh wp14">
   <w:body>
     <w:p>
       <w:pPr>
@@ -184,7 +184,23 @@
           <w:sz w:val="32"/>
           <w:szCs w:val="32"/>
         </w:rPr>
-        <w:t xml:space="preserve">«Название лабораторной работы» по дисциплине </w:t>
+        <w:t>«</w:t>
+      </w:r>
+      <w:r>
+        <w:rPr>
+          <w:b/>
+          <w:sz w:val="32"/>
+          <w:szCs w:val="32"/>
+        </w:rPr>
+        <w:t>Шифр Цезаря</w:t>
+      </w:r>
+      <w:r>
+        <w:rPr>
+          <w:b/>
+          <w:sz w:val="32"/>
+          <w:szCs w:val="32"/>
+        </w:rPr>
+        <w:t xml:space="preserve">» по дисциплине </w:t>
       </w:r>
     </w:p>
     <w:p>
@@ -207,7 +223,23 @@
           <w:sz w:val="32"/>
           <w:szCs w:val="32"/>
         </w:rPr>
-        <w:t xml:space="preserve">«Название дисциплины» </w:t>
+        <w:t>«</w:t>
+      </w:r>
+      <w:r>
+        <w:rPr>
+          <w:b/>
+          <w:sz w:val="32"/>
+          <w:szCs w:val="32"/>
+        </w:rPr>
+        <w:t>Защита Информации</w:t>
+      </w:r>
+      <w:r>
+        <w:rPr>
+          <w:b/>
+          <w:sz w:val="32"/>
+          <w:szCs w:val="32"/>
+        </w:rPr>
+        <w:t xml:space="preserve">» </w:t>
       </w:r>
     </w:p>
     <w:p>
@@ -390,7 +422,6 @@
         <w:rPr>
           <w:rFonts w:eastAsia="Times-Roman"/>
           <w:szCs w:val="28"/>
-          <w:lang w:val="en-US"/>
         </w:rPr>
       </w:pPr>
       <w:r>
@@ -409,7 +440,6 @@
         <w:rPr>
           <w:rFonts w:eastAsia="Times-Roman"/>
           <w:szCs w:val="28"/>
-          <w:lang w:val="en-US"/>
         </w:rPr>
       </w:pPr>
     </w:p>
@@ -457,7 +487,10 @@
         <w:pStyle w:val="Subtitle"/>
       </w:pPr>
       <w:r>
-        <w:t>Тема: Шифр Цезаря</w:t>
+        <w:t xml:space="preserve">Тема: Шифр </w:t>
+      </w:r>
+      <w:r>
+        <w:t>Цезаря</w:t>
       </w:r>
     </w:p>
     <w:p>
@@ -492,7 +525,10 @@
         </w:numPr>
       </w:pPr>
       <w:r>
-        <w:t>реализовать шифрование текста методом сдвига по русскому алфавиту;</w:t>
+        <w:t xml:space="preserve">реализовать </w:t>
+      </w:r>
+      <w:r>
+        <w:t>шифрование текста методом сдвига по русскому алфавиту;</w:t>
       </w:r>
     </w:p>
     <w:p>
@@ -540,7 +576,10 @@
         </w:numPr>
       </w:pPr>
       <w:r>
-        <w:t>отобразить таблицу алфавита и таблицу побуквенного преобразования;</w:t>
+        <w:t>отобраз</w:t>
+      </w:r>
+      <w:r>
+        <w:t>ить таблицу алфавита и таблицу побуквенного преобразования;</w:t>
       </w:r>
     </w:p>
     <w:p>
@@ -651,7 +690,10 @@
               <w:jc w:val="center"/>
             </w:pPr>
             <w:r>
-              <w:t>Изучение алгоритма шифра Цезаря и определение требований к приложению.</w:t>
+              <w:t xml:space="preserve">Изучение алгоритма шифра Цезаря и </w:t>
+            </w:r>
+            <w:r>
+              <w:t>определение требований к приложению.</w:t>
             </w:r>
           </w:p>
         </w:tc>
@@ -733,7 +775,10 @@
               <w:jc w:val="center"/>
             </w:pPr>
             <w:r>
-              <w:t xml:space="preserve">Реализация функций шифрования, дешифрования, валидации ключа и </w:t>
+              <w:t>Реализация функций</w:t>
+            </w:r>
+            <w:r>
+              <w:t xml:space="preserve"> шифрования, дешифрования, валидации ключа и </w:t>
             </w:r>
             <w:r>
               <w:lastRenderedPageBreak/>
@@ -820,7 +865,10 @@
               <w:jc w:val="left"/>
             </w:pPr>
             <w:r>
-              <w:t>Проверка работы программы на тестовых строках.</w:t>
+              <w:t xml:space="preserve">Проверка работы программы на тестовых </w:t>
+            </w:r>
+            <w:r>
+              <w:t>строках.</w:t>
             </w:r>
           </w:p>
         </w:tc>
@@ -865,7 +913,14 @@
           <w:b/>
           <w:bCs/>
         </w:rPr>
-        <w:t>Nuxt 4</w:t>
+        <w:t xml:space="preserve">Nuxt </w:t>
+      </w:r>
+      <w:r>
+        <w:rPr>
+          <w:b/>
+          <w:bCs/>
+        </w:rPr>
+        <w:t>4</w:t>
       </w:r>
       <w:r>
         <w:t xml:space="preserve"> — фреймворк для разработки приложений на Vue, использован для структуры проекта и маршрутизации страниц.</w:t>
@@ -906,7 +961,10 @@
         <w:t>TypeScript</w:t>
       </w:r>
       <w:r>
-        <w:t xml:space="preserve"> — использован для типизации функций, интерфейсов таблиц и данных статистики.</w:t>
+        <w:t xml:space="preserve"> — использован для т</w:t>
+      </w:r>
+      <w:r>
+        <w:t>ипизации функций, интерфейсов таблиц и данных статистики.</w:t>
       </w:r>
     </w:p>
     <w:p>
@@ -963,7 +1021,10 @@
         <w:t>@vueuse/motion</w:t>
       </w:r>
       <w:r>
-        <w:t xml:space="preserve"> — использован для небольших анимаций появления блоков интерфейса.</w:t>
+        <w:t xml:space="preserve"> — использован д</w:t>
+      </w:r>
+      <w:r>
+        <w:t>ля небольших анимаций появления блоков интерфейса.</w:t>
       </w:r>
     </w:p>
     <w:p>
@@ -980,7 +1041,10 @@
       </w:r>
       <w:r>
         <w:lastRenderedPageBreak/>
-        <w:t>фиксированное число позиций дальше. Это число называется ключом или сдвигом. Для русского алфавита в работе используется 33 символа, включая букву «Ё».</w:t>
+        <w:t>фиксированное число позиций дальше. Это число</w:t>
+      </w:r>
+      <w:r>
+        <w:t xml:space="preserve"> называется ключом или сдвигом. Для русского алфавита в работе используется 33 символа, включая букву «Ё».</w:t>
       </w:r>
     </w:p>
     <w:p>
@@ -990,7 +1054,10 @@
     </w:p>
     <w:p>
       <w:r>
-        <w:t>Формула дешифрования: D(x) = (x - n) mod 33. Операция взятия остатка по модулю обеспечивает циклический переход от конца алфавита к его началу.</w:t>
+        <w:t xml:space="preserve">Формула дешифрования: D(x) = (x - n) mod 33. </w:t>
+      </w:r>
+      <w:r>
+        <w:t>Операция взятия остатка по модулю обеспечивает циклический переход от конца алфавита к его началу.</w:t>
       </w:r>
     </w:p>
     <w:p>
@@ -1003,7 +1070,10 @@
     </w:p>
     <w:p>
       <w:r>
-        <w:t>В результате выполнения лабораторной работы создано веб-приложение «Шифр Цезаря». Пользователь вводит исходный текст, задает ключ сдвига от 0 до 33 и выбирает действие: зашифровать или расшифровать. После обработки программа выводит результат, статистику текста и таблицу побуквенного преобразования.</w:t>
+        <w:t>В результате выполнения лабораторной работы создано веб-приложение «Шифр Цезаря». Пользователь вводит исходный текст, задает ключ сдви</w:t>
+      </w:r>
+      <w:r>
+        <w:t>га от 0 до 33 и выбирает действие: зашифровать или расшифровать. После обработки программа выводит результат, статистику текста и таблицу побуквенного преобразования.</w:t>
       </w:r>
     </w:p>
     <w:p>
@@ -1080,7 +1150,10 @@
         </w:numPr>
       </w:pPr>
       <w:r>
-        <w:t>копирование результата в буфер обмена;</w:t>
+        <w:t>копировани</w:t>
+      </w:r>
+      <w:r>
+        <w:t>е результата в буфер обмена;</w:t>
       </w:r>
     </w:p>
     <w:p>
@@ -1422,7 +1495,10 @@
     </w:p>
     <w:p>
       <w:r>
-        <w:t>Ключевая логика лабораторной работы находится в файле app/labs/lab1-caesar.ts. Ниже приведены основные фрагменты реализации.</w:t>
+        <w:t>Ключевая логика лабораторн</w:t>
+      </w:r>
+      <w:r>
+        <w:t>ой работы находится в файле app/labs/lab1-caesar.ts. Ниже приведены основные фрагменты реализации.</w:t>
       </w:r>
     </w:p>
     <w:p>
@@ -1452,7 +1528,13 @@
         <w:rPr>
           <w:rFonts w:cs="Consolas"/>
         </w:rPr>
-        <w:t>export const CYRILLIC_LOWER = 'абвгдеёжзийклмнопрстуфхцчшщъыьэюя'</w:t>
+        <w:t>export const CYRILLIC_LOWER = 'абвгдеёжзийклмнопрсту</w:t>
+      </w:r>
+      <w:r>
+        <w:rPr>
+          <w:rFonts w:cs="Consolas"/>
+        </w:rPr>
+        <w:t>фхцчшщъыьэюя'</w:t>
       </w:r>
     </w:p>
     <w:p>
@@ -1490,95 +1572,22 @@
           <w:rFonts w:cs="Consolas"/>
           <w:lang w:val="en-US"/>
         </w:rPr>
-        <w:t xml:space="preserve">export function </w:t>
-      </w:r>
-      <w:proofErr w:type="spellStart"/>
-      <w:proofErr w:type="gramStart"/>
-      <w:r>
-        <w:rPr>
-          <w:rFonts w:cs="Consolas"/>
-          <w:lang w:val="en-US"/>
-        </w:rPr>
-        <w:t>isCyrillicChar</w:t>
-      </w:r>
-      <w:proofErr w:type="spellEnd"/>
-      <w:r>
-        <w:rPr>
-          <w:rFonts w:cs="Consolas"/>
-          <w:lang w:val="en-US"/>
-        </w:rPr>
-        <w:t>(</w:t>
-      </w:r>
-      <w:proofErr w:type="gramEnd"/>
-      <w:r>
-        <w:rPr>
-          <w:rFonts w:cs="Consolas"/>
-          <w:lang w:val="en-US"/>
-        </w:rPr>
-        <w:t xml:space="preserve">char: string): </w:t>
-      </w:r>
-      <w:proofErr w:type="spellStart"/>
-      <w:r>
-        <w:rPr>
-          <w:rFonts w:cs="Consolas"/>
-          <w:lang w:val="en-US"/>
-        </w:rPr>
-        <w:t>boolean</w:t>
-      </w:r>
-      <w:proofErr w:type="spellEnd"/>
-      <w:r>
-        <w:rPr>
-          <w:rFonts w:cs="Consolas"/>
-          <w:lang w:val="en-US"/>
-        </w:rPr>
-        <w:t xml:space="preserve"> {</w:t>
-      </w:r>
-    </w:p>
-    <w:p>
-      <w:pPr>
-        <w:pStyle w:val="CodeBlock"/>
-        <w:rPr>
-          <w:lang w:val="en-US"/>
-        </w:rPr>
-      </w:pPr>
-      <w:r>
-        <w:rPr>
-          <w:rFonts w:cs="Consolas"/>
-          <w:lang w:val="en-US"/>
-        </w:rPr>
-        <w:t xml:space="preserve">  return </w:t>
-      </w:r>
-      <w:proofErr w:type="spellStart"/>
-      <w:r>
-        <w:rPr>
-          <w:rFonts w:cs="Consolas"/>
-          <w:lang w:val="en-US"/>
-        </w:rPr>
-        <w:t>CYRILLIC_UPPER.includes</w:t>
-      </w:r>
-      <w:proofErr w:type="spellEnd"/>
-      <w:r>
-        <w:rPr>
-          <w:rFonts w:cs="Consolas"/>
-          <w:lang w:val="en-US"/>
-        </w:rPr>
-        <w:t xml:space="preserve">(char) || </w:t>
-      </w:r>
-      <w:proofErr w:type="spellStart"/>
-      <w:r>
-        <w:rPr>
-          <w:rFonts w:cs="Consolas"/>
-          <w:lang w:val="en-US"/>
-        </w:rPr>
-        <w:t>CYRILLIC_LOWER.includes</w:t>
-      </w:r>
-      <w:proofErr w:type="spellEnd"/>
-      <w:r>
-        <w:rPr>
-          <w:rFonts w:cs="Consolas"/>
-          <w:lang w:val="en-US"/>
-        </w:rPr>
-        <w:t>(char)</w:t>
+        <w:t>export function isCyrillicChar(char: string): boolean {</w:t>
+      </w:r>
+    </w:p>
+    <w:p>
+      <w:pPr>
+        <w:pStyle w:val="CodeBlock"/>
+        <w:rPr>
+          <w:lang w:val="en-US"/>
+        </w:rPr>
+      </w:pPr>
+      <w:r>
+        <w:rPr>
+          <w:rFonts w:cs="Consolas"/>
+          <w:lang w:val="en-US"/>
+        </w:rPr>
+        <w:t xml:space="preserve">  return CYRILLIC_UPPER.includes(char) || CYRILLIC_LOWER.includes(char)</w:t>
       </w:r>
     </w:p>
     <w:p>
@@ -1644,88 +1653,29 @@
           <w:rFonts w:cs="Consolas"/>
           <w:lang w:val="en-US"/>
         </w:rPr>
-        <w:t xml:space="preserve">function </w:t>
-      </w:r>
-      <w:proofErr w:type="spellStart"/>
-      <w:proofErr w:type="gramStart"/>
-      <w:r>
-        <w:rPr>
-          <w:rFonts w:cs="Consolas"/>
-          <w:lang w:val="en-US"/>
-        </w:rPr>
-        <w:t>shiftChar</w:t>
-      </w:r>
-      <w:proofErr w:type="spellEnd"/>
-      <w:r>
-        <w:rPr>
-          <w:rFonts w:cs="Consolas"/>
-          <w:lang w:val="en-US"/>
-        </w:rPr>
-        <w:t>(</w:t>
-      </w:r>
-      <w:proofErr w:type="gramEnd"/>
-      <w:r>
-        <w:rPr>
-          <w:rFonts w:cs="Consolas"/>
-          <w:lang w:val="en-US"/>
-        </w:rPr>
-        <w:t xml:space="preserve">char: string, shift: number, encrypt: </w:t>
-      </w:r>
-      <w:proofErr w:type="spellStart"/>
-      <w:r>
-        <w:rPr>
-          <w:rFonts w:cs="Consolas"/>
-          <w:lang w:val="en-US"/>
-        </w:rPr>
-        <w:t>boolean</w:t>
-      </w:r>
-      <w:proofErr w:type="spellEnd"/>
-      <w:r>
-        <w:rPr>
-          <w:rFonts w:cs="Consolas"/>
-          <w:lang w:val="en-US"/>
-        </w:rPr>
-        <w:t>): string {</w:t>
-      </w:r>
-    </w:p>
-    <w:p>
-      <w:pPr>
-        <w:pStyle w:val="CodeBlock"/>
-        <w:rPr>
-          <w:lang w:val="en-US"/>
-        </w:rPr>
-      </w:pPr>
-      <w:r>
-        <w:rPr>
-          <w:rFonts w:cs="Consolas"/>
-          <w:lang w:val="en-US"/>
-        </w:rPr>
-        <w:t xml:space="preserve">  if </w:t>
-      </w:r>
-      <w:proofErr w:type="gramStart"/>
-      <w:r>
-        <w:rPr>
-          <w:rFonts w:cs="Consolas"/>
-          <w:lang w:val="en-US"/>
-        </w:rPr>
-        <w:t>(!</w:t>
-      </w:r>
-      <w:proofErr w:type="spellStart"/>
-      <w:r>
-        <w:rPr>
-          <w:rFonts w:cs="Consolas"/>
-          <w:lang w:val="en-US"/>
-        </w:rPr>
-        <w:t>isCyrillicChar</w:t>
-      </w:r>
-      <w:proofErr w:type="spellEnd"/>
-      <w:proofErr w:type="gramEnd"/>
-      <w:r>
-        <w:rPr>
-          <w:rFonts w:cs="Consolas"/>
-          <w:lang w:val="en-US"/>
-        </w:rPr>
-        <w:t>(char)) {</w:t>
+        <w:t>function shiftChar(</w:t>
+      </w:r>
+      <w:r>
+        <w:rPr>
+          <w:rFonts w:cs="Consolas"/>
+          <w:lang w:val="en-US"/>
+        </w:rPr>
+        <w:t>char: string, shift: number, encrypt: boolean): string {</w:t>
+      </w:r>
+    </w:p>
+    <w:p>
+      <w:pPr>
+        <w:pStyle w:val="CodeBlock"/>
+        <w:rPr>
+          <w:lang w:val="en-US"/>
+        </w:rPr>
+      </w:pPr>
+      <w:r>
+        <w:rPr>
+          <w:rFonts w:cs="Consolas"/>
+          <w:lang w:val="en-US"/>
+        </w:rPr>
+        <w:t xml:space="preserve">  if (!isCyrillicChar(char)) {</w:t>
       </w:r>
     </w:p>
     <w:p>
@@ -1778,24 +1728,597 @@
           <w:rFonts w:cs="Consolas"/>
           <w:lang w:val="en-US"/>
         </w:rPr>
-        <w:t xml:space="preserve">  const index = </w:t>
-      </w:r>
-      <w:proofErr w:type="spellStart"/>
-      <w:r>
-        <w:rPr>
-          <w:rFonts w:cs="Consolas"/>
-          <w:lang w:val="en-US"/>
-        </w:rPr>
-        <w:t>getCharIndex</w:t>
-      </w:r>
-      <w:proofErr w:type="spellEnd"/>
-      <w:r>
-        <w:rPr>
-          <w:rFonts w:cs="Consolas"/>
-          <w:lang w:val="en-US"/>
-        </w:rPr>
-        <w:t>(char)</w:t>
-      </w:r>
+        <w:t xml:space="preserve">  const index = getCharIndex(char)</w:t>
+      </w:r>
+    </w:p>
+    <w:p>
+      <w:pPr>
+        <w:pStyle w:val="CodeBlock"/>
+        <w:rPr>
+          <w:lang w:val="en-US"/>
+        </w:rPr>
+      </w:pPr>
+      <w:r>
+        <w:rPr>
+          <w:rFonts w:cs="Consolas"/>
+          <w:lang w:val="en-US"/>
+        </w:rPr>
+        <w:t xml:space="preserve">  const isUpper = isUpperCase(char)</w:t>
+      </w:r>
+    </w:p>
+    <w:p>
+      <w:pPr>
+        <w:pStyle w:val="CodeBlock"/>
+        <w:rPr>
+          <w:lang w:val="en-US"/>
+        </w:rPr>
+      </w:pPr>
+      <w:r>
+        <w:rPr>
+          <w:rFonts w:cs="Consolas"/>
+          <w:lang w:val="en-US"/>
+        </w:rPr>
+        <w:t xml:space="preserve">  const actualShift = encrypt ? shift : -shift</w:t>
+      </w:r>
+    </w:p>
+    <w:p>
+      <w:pPr>
+        <w:pStyle w:val="CodeBlock"/>
+        <w:rPr>
+          <w:lang w:val="en-US"/>
+        </w:rPr>
+      </w:pPr>
+    </w:p>
+    <w:p>
+      <w:pPr>
+        <w:pStyle w:val="CodeBlock"/>
+        <w:rPr>
+          <w:lang w:val="en-US"/>
+        </w:rPr>
+      </w:pPr>
+      <w:r>
+        <w:rPr>
+          <w:rFonts w:cs="Consolas"/>
+          <w:lang w:val="en-US"/>
+        </w:rPr>
+        <w:t xml:space="preserve">  let newIndex = (index + ac</w:t>
+      </w:r>
+      <w:r>
+        <w:rPr>
+          <w:rFonts w:cs="Consolas"/>
+          <w:lang w:val="en-US"/>
+        </w:rPr>
+        <w:t>tualShift) % ALPHABET_SIZE</w:t>
+      </w:r>
+    </w:p>
+    <w:p>
+      <w:pPr>
+        <w:pStyle w:val="CodeBlock"/>
+        <w:rPr>
+          <w:lang w:val="en-US"/>
+        </w:rPr>
+      </w:pPr>
+      <w:r>
+        <w:rPr>
+          <w:rFonts w:cs="Consolas"/>
+          <w:lang w:val="en-US"/>
+        </w:rPr>
+        <w:t xml:space="preserve">  if (newIndex &lt; 0) {</w:t>
+      </w:r>
+    </w:p>
+    <w:p>
+      <w:pPr>
+        <w:pStyle w:val="CodeBlock"/>
+        <w:rPr>
+          <w:lang w:val="en-US"/>
+        </w:rPr>
+      </w:pPr>
+      <w:r>
+        <w:rPr>
+          <w:rFonts w:cs="Consolas"/>
+          <w:lang w:val="en-US"/>
+        </w:rPr>
+        <w:t xml:space="preserve">    newIndex += ALPHABET_SIZE</w:t>
+      </w:r>
+    </w:p>
+    <w:p>
+      <w:pPr>
+        <w:pStyle w:val="CodeBlock"/>
+        <w:rPr>
+          <w:lang w:val="en-US"/>
+        </w:rPr>
+      </w:pPr>
+      <w:r>
+        <w:rPr>
+          <w:rFonts w:cs="Consolas"/>
+          <w:lang w:val="en-US"/>
+        </w:rPr>
+        <w:t xml:space="preserve">  }</w:t>
+      </w:r>
+    </w:p>
+    <w:p>
+      <w:pPr>
+        <w:pStyle w:val="CodeBlock"/>
+        <w:rPr>
+          <w:lang w:val="en-US"/>
+        </w:rPr>
+      </w:pPr>
+    </w:p>
+    <w:p>
+      <w:pPr>
+        <w:pStyle w:val="CodeBlock"/>
+        <w:rPr>
+          <w:lang w:val="en-US"/>
+        </w:rPr>
+      </w:pPr>
+      <w:r>
+        <w:rPr>
+          <w:rFonts w:cs="Consolas"/>
+          <w:lang w:val="en-US"/>
+        </w:rPr>
+        <w:t xml:space="preserve">  return isUpper ? CYRILLIC_UPPER[newIndex] : CYRILLIC_LOWER[newIndex]</w:t>
+      </w:r>
+    </w:p>
+    <w:p>
+      <w:pPr>
+        <w:pStyle w:val="CodeBlock"/>
+        <w:rPr>
+          <w:lang w:val="en-US"/>
+        </w:rPr>
+      </w:pPr>
+      <w:r>
+        <w:rPr>
+          <w:rFonts w:cs="Consolas"/>
+          <w:lang w:val="en-US"/>
+        </w:rPr>
+        <w:t>}</w:t>
+      </w:r>
+    </w:p>
+    <w:p>
+      <w:pPr>
+        <w:pStyle w:val="Heading2"/>
+        <w:rPr>
+          <w:lang w:val="en-US"/>
+        </w:rPr>
+      </w:pPr>
+      <w:r>
+        <w:t>Функции</w:t>
+      </w:r>
+      <w:r>
+        <w:rPr>
+          <w:lang w:val="en-US"/>
+        </w:rPr>
+        <w:t xml:space="preserve"> </w:t>
+      </w:r>
+      <w:r>
+        <w:t>шифрования</w:t>
+      </w:r>
+      <w:r>
+        <w:rPr>
+          <w:lang w:val="en-US"/>
+        </w:rPr>
+        <w:t xml:space="preserve"> </w:t>
+      </w:r>
+      <w:r>
+        <w:t>и</w:t>
+      </w:r>
+      <w:r>
+        <w:rPr>
+          <w:lang w:val="en-US"/>
+        </w:rPr>
+        <w:t xml:space="preserve"> </w:t>
+      </w:r>
+      <w:r>
+        <w:t>дешифрования</w:t>
+      </w:r>
+      <w:r>
+        <w:rPr>
+          <w:lang w:val="en-US"/>
+        </w:rPr>
+        <w:t>:</w:t>
+      </w:r>
+    </w:p>
+    <w:p>
+      <w:pPr>
+        <w:pStyle w:val="CodeBlock"/>
+        <w:rPr>
+          <w:lang w:val="en-US"/>
+        </w:rPr>
+      </w:pPr>
+      <w:r>
+        <w:rPr>
+          <w:rFonts w:cs="Consolas"/>
+          <w:lang w:val="en-US"/>
+        </w:rPr>
+        <w:t>export function encryptCaesar(text: string, shift: number): stri</w:t>
+      </w:r>
+      <w:r>
+        <w:rPr>
+          <w:rFonts w:cs="Consolas"/>
+          <w:lang w:val="en-US"/>
+        </w:rPr>
+        <w:t>ng {</w:t>
+      </w:r>
+    </w:p>
+    <w:p>
+      <w:pPr>
+        <w:pStyle w:val="CodeBlock"/>
+        <w:rPr>
+          <w:lang w:val="en-US"/>
+        </w:rPr>
+      </w:pPr>
+      <w:r>
+        <w:rPr>
+          <w:rFonts w:cs="Consolas"/>
+          <w:lang w:val="en-US"/>
+        </w:rPr>
+        <w:t xml:space="preserve">  if (!Number.isInteger(shift)) {</w:t>
+      </w:r>
+    </w:p>
+    <w:p>
+      <w:pPr>
+        <w:pStyle w:val="CodeBlock"/>
+        <w:rPr>
+          <w:lang w:val="en-US"/>
+        </w:rPr>
+      </w:pPr>
+      <w:r>
+        <w:rPr>
+          <w:rFonts w:cs="Consolas"/>
+          <w:lang w:val="en-US"/>
+        </w:rPr>
+        <w:t xml:space="preserve">    throw new Error('</w:t>
+      </w:r>
+      <w:r>
+        <w:rPr>
+          <w:rFonts w:cs="Consolas"/>
+        </w:rPr>
+        <w:t>Сдвиг</w:t>
+      </w:r>
+      <w:r>
+        <w:rPr>
+          <w:rFonts w:cs="Consolas"/>
+          <w:lang w:val="en-US"/>
+        </w:rPr>
+        <w:t xml:space="preserve"> </w:t>
+      </w:r>
+      <w:r>
+        <w:rPr>
+          <w:rFonts w:cs="Consolas"/>
+        </w:rPr>
+        <w:t>должен</w:t>
+      </w:r>
+      <w:r>
+        <w:rPr>
+          <w:rFonts w:cs="Consolas"/>
+          <w:lang w:val="en-US"/>
+        </w:rPr>
+        <w:t xml:space="preserve"> </w:t>
+      </w:r>
+      <w:r>
+        <w:rPr>
+          <w:rFonts w:cs="Consolas"/>
+        </w:rPr>
+        <w:t>быть</w:t>
+      </w:r>
+      <w:r>
+        <w:rPr>
+          <w:rFonts w:cs="Consolas"/>
+          <w:lang w:val="en-US"/>
+        </w:rPr>
+        <w:t xml:space="preserve"> </w:t>
+      </w:r>
+      <w:r>
+        <w:rPr>
+          <w:rFonts w:cs="Consolas"/>
+        </w:rPr>
+        <w:t>целым</w:t>
+      </w:r>
+      <w:r>
+        <w:rPr>
+          <w:rFonts w:cs="Consolas"/>
+          <w:lang w:val="en-US"/>
+        </w:rPr>
+        <w:t xml:space="preserve"> </w:t>
+      </w:r>
+      <w:r>
+        <w:rPr>
+          <w:rFonts w:cs="Consolas"/>
+        </w:rPr>
+        <w:t>числом</w:t>
+      </w:r>
+      <w:r>
+        <w:rPr>
+          <w:rFonts w:cs="Consolas"/>
+          <w:lang w:val="en-US"/>
+        </w:rPr>
+        <w:t>')</w:t>
+      </w:r>
+    </w:p>
+    <w:p>
+      <w:pPr>
+        <w:pStyle w:val="CodeBlock"/>
+        <w:rPr>
+          <w:lang w:val="en-US"/>
+        </w:rPr>
+      </w:pPr>
+      <w:r>
+        <w:rPr>
+          <w:rFonts w:cs="Consolas"/>
+          <w:lang w:val="en-US"/>
+        </w:rPr>
+        <w:t xml:space="preserve">  }</w:t>
+      </w:r>
+    </w:p>
+    <w:p>
+      <w:pPr>
+        <w:pStyle w:val="CodeBlock"/>
+        <w:rPr>
+          <w:lang w:val="en-US"/>
+        </w:rPr>
+      </w:pPr>
+    </w:p>
+    <w:p>
+      <w:pPr>
+        <w:pStyle w:val="CodeBlock"/>
+        <w:rPr>
+          <w:lang w:val="en-US"/>
+        </w:rPr>
+      </w:pPr>
+      <w:r>
+        <w:rPr>
+          <w:rFonts w:cs="Consolas"/>
+          <w:lang w:val="en-US"/>
+        </w:rPr>
+        <w:t xml:space="preserve">  const normalizedShift = ((shift % ALPHABET_SIZE) + ALPHABET_SIZE) % ALPHABET_SIZE</w:t>
+      </w:r>
+    </w:p>
+    <w:p>
+      <w:pPr>
+        <w:pStyle w:val="CodeBlock"/>
+        <w:rPr>
+          <w:lang w:val="en-US"/>
+        </w:rPr>
+      </w:pPr>
+      <w:r>
+        <w:rPr>
+          <w:rFonts w:cs="Consolas"/>
+          <w:lang w:val="en-US"/>
+        </w:rPr>
+        <w:t xml:space="preserve">  let result = ''</w:t>
+      </w:r>
+    </w:p>
+    <w:p>
+      <w:pPr>
+        <w:pStyle w:val="CodeBlock"/>
+        <w:rPr>
+          <w:lang w:val="en-US"/>
+        </w:rPr>
+      </w:pPr>
+    </w:p>
+    <w:p>
+      <w:pPr>
+        <w:pStyle w:val="CodeBlock"/>
+        <w:rPr>
+          <w:lang w:val="en-US"/>
+        </w:rPr>
+      </w:pPr>
+      <w:r>
+        <w:rPr>
+          <w:rFonts w:cs="Consolas"/>
+          <w:lang w:val="en-US"/>
+        </w:rPr>
+        <w:t xml:space="preserve">  for (const char of text) {</w:t>
+      </w:r>
+    </w:p>
+    <w:p>
+      <w:pPr>
+        <w:pStyle w:val="CodeBlock"/>
+        <w:rPr>
+          <w:lang w:val="en-US"/>
+        </w:rPr>
+      </w:pPr>
+      <w:r>
+        <w:rPr>
+          <w:rFonts w:cs="Consolas"/>
+          <w:lang w:val="en-US"/>
+        </w:rPr>
+        <w:t xml:space="preserve">    result += shiftChar(char, normalizedShift, true)</w:t>
+      </w:r>
+    </w:p>
+    <w:p>
+      <w:pPr>
+        <w:pStyle w:val="CodeBlock"/>
+        <w:rPr>
+          <w:lang w:val="en-US"/>
+        </w:rPr>
+      </w:pPr>
+      <w:r>
+        <w:rPr>
+          <w:rFonts w:cs="Consolas"/>
+          <w:lang w:val="en-US"/>
+        </w:rPr>
+        <w:t xml:space="preserve">  }</w:t>
+      </w:r>
+    </w:p>
+    <w:p>
+      <w:pPr>
+        <w:pStyle w:val="CodeBlock"/>
+        <w:rPr>
+          <w:lang w:val="en-US"/>
+        </w:rPr>
+      </w:pPr>
+    </w:p>
+    <w:p>
+      <w:pPr>
+        <w:pStyle w:val="CodeBlock"/>
+        <w:rPr>
+          <w:lang w:val="en-US"/>
+        </w:rPr>
+      </w:pPr>
+      <w:r>
+        <w:rPr>
+          <w:rFonts w:cs="Consolas"/>
+          <w:lang w:val="en-US"/>
+        </w:rPr>
+        <w:t xml:space="preserve">  return result</w:t>
+      </w:r>
+    </w:p>
+    <w:p>
+      <w:pPr>
+        <w:pStyle w:val="CodeBlock"/>
+        <w:rPr>
+          <w:lang w:val="en-US"/>
+        </w:rPr>
+      </w:pPr>
+      <w:r>
+        <w:rPr>
+          <w:rFonts w:cs="Consolas"/>
+          <w:lang w:val="en-US"/>
+        </w:rPr>
+        <w:t>}</w:t>
+      </w:r>
+    </w:p>
+    <w:p>
+      <w:pPr>
+        <w:pStyle w:val="CodeBlock"/>
+        <w:rPr>
+          <w:lang w:val="en-US"/>
+        </w:rPr>
+      </w:pPr>
+    </w:p>
+    <w:p>
+      <w:pPr>
+        <w:pStyle w:val="CodeBlock"/>
+        <w:rPr>
+          <w:lang w:val="en-US"/>
+        </w:rPr>
+      </w:pPr>
+      <w:r>
+        <w:rPr>
+          <w:rFonts w:cs="Consolas"/>
+          <w:lang w:val="en-US"/>
+        </w:rPr>
+        <w:t>export function decryptCaesar(text: string, shift: number): string {</w:t>
+      </w:r>
+    </w:p>
+    <w:p>
+      <w:pPr>
+        <w:pStyle w:val="CodeBlock"/>
+        <w:rPr>
+          <w:lang w:val="en-US"/>
+        </w:rPr>
+      </w:pPr>
+      <w:r>
+        <w:rPr>
+          <w:rFonts w:cs="Consolas"/>
+          <w:lang w:val="en-US"/>
+        </w:rPr>
+        <w:t xml:space="preserve">  if (!Number.isInteger(shift)) {</w:t>
+      </w:r>
+    </w:p>
+    <w:p>
+      <w:pPr>
+        <w:pStyle w:val="CodeBlock"/>
+        <w:rPr>
+          <w:lang w:val="en-US"/>
+        </w:rPr>
+      </w:pPr>
+      <w:r>
+        <w:rPr>
+          <w:rFonts w:cs="Consolas"/>
+          <w:lang w:val="en-US"/>
+        </w:rPr>
+        <w:t xml:space="preserve">    throw new Error('</w:t>
+      </w:r>
+      <w:r>
+        <w:rPr>
+          <w:rFonts w:cs="Consolas"/>
+        </w:rPr>
+        <w:t>Сдвиг</w:t>
+      </w:r>
+      <w:r>
+        <w:rPr>
+          <w:rFonts w:cs="Consolas"/>
+          <w:lang w:val="en-US"/>
+        </w:rPr>
+        <w:t xml:space="preserve"> </w:t>
+      </w:r>
+      <w:r>
+        <w:rPr>
+          <w:rFonts w:cs="Consolas"/>
+        </w:rPr>
+        <w:t>должен</w:t>
+      </w:r>
+      <w:r>
+        <w:rPr>
+          <w:rFonts w:cs="Consolas"/>
+          <w:lang w:val="en-US"/>
+        </w:rPr>
+        <w:t xml:space="preserve"> </w:t>
+      </w:r>
+      <w:r>
+        <w:rPr>
+          <w:rFonts w:cs="Consolas"/>
+        </w:rPr>
+        <w:t>быть</w:t>
+      </w:r>
+      <w:r>
+        <w:rPr>
+          <w:rFonts w:cs="Consolas"/>
+          <w:lang w:val="en-US"/>
+        </w:rPr>
+        <w:t xml:space="preserve"> </w:t>
+      </w:r>
+      <w:r>
+        <w:rPr>
+          <w:rFonts w:cs="Consolas"/>
+        </w:rPr>
+        <w:t>целым</w:t>
+      </w:r>
+      <w:r>
+        <w:rPr>
+          <w:rFonts w:cs="Consolas"/>
+          <w:lang w:val="en-US"/>
+        </w:rPr>
+        <w:t xml:space="preserve"> </w:t>
+      </w:r>
+      <w:r>
+        <w:rPr>
+          <w:rFonts w:cs="Consolas"/>
+        </w:rPr>
+        <w:t>числом</w:t>
+      </w:r>
+      <w:r>
+        <w:rPr>
+          <w:rFonts w:cs="Consolas"/>
+          <w:lang w:val="en-US"/>
+        </w:rPr>
+        <w:t>')</w:t>
+      </w:r>
+    </w:p>
+    <w:p>
+      <w:pPr>
+        <w:pStyle w:val="CodeBlock"/>
+        <w:rPr>
+          <w:lang w:val="en-US"/>
+        </w:rPr>
+      </w:pPr>
+      <w:r>
+        <w:rPr>
+          <w:rFonts w:cs="Consolas"/>
+          <w:lang w:val="en-US"/>
+        </w:rPr>
+        <w:t xml:space="preserve">  }</w:t>
+      </w:r>
+    </w:p>
+    <w:p>
+      <w:pPr>
+        <w:pStyle w:val="CodeBlock"/>
+        <w:rPr>
+          <w:lang w:val="en-US"/>
+        </w:rPr>
+      </w:pPr>
     </w:p>
     <w:p>
       <w:pPr>
@@ -1811,201 +2334,65 @@
         </w:rPr>
         <w:t xml:space="preserve">  const </w:t>
       </w:r>
-      <w:proofErr w:type="spellStart"/>
-      <w:r>
-        <w:rPr>
-          <w:rFonts w:cs="Consolas"/>
-          <w:lang w:val="en-US"/>
-        </w:rPr>
-        <w:t>isUpper</w:t>
-      </w:r>
-      <w:proofErr w:type="spellEnd"/>
-      <w:r>
-        <w:rPr>
-          <w:rFonts w:cs="Consolas"/>
-          <w:lang w:val="en-US"/>
-        </w:rPr>
-        <w:t xml:space="preserve"> = </w:t>
-      </w:r>
-      <w:proofErr w:type="spellStart"/>
-      <w:r>
-        <w:rPr>
-          <w:rFonts w:cs="Consolas"/>
-          <w:lang w:val="en-US"/>
-        </w:rPr>
-        <w:t>isUpperCase</w:t>
-      </w:r>
-      <w:proofErr w:type="spellEnd"/>
-      <w:r>
-        <w:rPr>
-          <w:rFonts w:cs="Consolas"/>
-          <w:lang w:val="en-US"/>
-        </w:rPr>
-        <w:t>(char)</w:t>
-      </w:r>
-    </w:p>
-    <w:p>
-      <w:pPr>
-        <w:pStyle w:val="CodeBlock"/>
-        <w:rPr>
-          <w:lang w:val="en-US"/>
-        </w:rPr>
-      </w:pPr>
-      <w:r>
-        <w:rPr>
-          <w:rFonts w:cs="Consolas"/>
-          <w:lang w:val="en-US"/>
-        </w:rPr>
-        <w:t xml:space="preserve">  const </w:t>
-      </w:r>
-      <w:proofErr w:type="spellStart"/>
-      <w:r>
-        <w:rPr>
-          <w:rFonts w:cs="Consolas"/>
-          <w:lang w:val="en-US"/>
-        </w:rPr>
-        <w:t>actualShift</w:t>
-      </w:r>
-      <w:proofErr w:type="spellEnd"/>
-      <w:r>
-        <w:rPr>
-          <w:rFonts w:cs="Consolas"/>
-          <w:lang w:val="en-US"/>
-        </w:rPr>
-        <w:t xml:space="preserve"> = </w:t>
-      </w:r>
-      <w:proofErr w:type="gramStart"/>
-      <w:r>
-        <w:rPr>
-          <w:rFonts w:cs="Consolas"/>
-          <w:lang w:val="en-US"/>
-        </w:rPr>
-        <w:t>encrypt ?</w:t>
-      </w:r>
-      <w:proofErr w:type="gramEnd"/>
-      <w:r>
-        <w:rPr>
-          <w:rFonts w:cs="Consolas"/>
-          <w:lang w:val="en-US"/>
-        </w:rPr>
-        <w:t xml:space="preserve"> shift : -shift</w:t>
-      </w:r>
-    </w:p>
-    <w:p>
-      <w:pPr>
-        <w:pStyle w:val="CodeBlock"/>
-        <w:rPr>
-          <w:lang w:val="en-US"/>
-        </w:rPr>
-      </w:pPr>
-    </w:p>
-    <w:p>
-      <w:pPr>
-        <w:pStyle w:val="CodeBlock"/>
-        <w:rPr>
-          <w:lang w:val="en-US"/>
-        </w:rPr>
-      </w:pPr>
-      <w:r>
-        <w:rPr>
-          <w:rFonts w:cs="Consolas"/>
-          <w:lang w:val="en-US"/>
-        </w:rPr>
-        <w:t xml:space="preserve">  let </w:t>
-      </w:r>
-      <w:proofErr w:type="spellStart"/>
-      <w:r>
-        <w:rPr>
-          <w:rFonts w:cs="Consolas"/>
-          <w:lang w:val="en-US"/>
-        </w:rPr>
-        <w:t>newIndex</w:t>
-      </w:r>
-      <w:proofErr w:type="spellEnd"/>
-      <w:r>
-        <w:rPr>
-          <w:rFonts w:cs="Consolas"/>
-          <w:lang w:val="en-US"/>
-        </w:rPr>
-        <w:t xml:space="preserve"> = (index + </w:t>
-      </w:r>
-      <w:proofErr w:type="spellStart"/>
-      <w:r>
-        <w:rPr>
-          <w:rFonts w:cs="Consolas"/>
-          <w:lang w:val="en-US"/>
-        </w:rPr>
-        <w:t>actualShift</w:t>
-      </w:r>
-      <w:proofErr w:type="spellEnd"/>
-      <w:r>
-        <w:rPr>
-          <w:rFonts w:cs="Consolas"/>
-          <w:lang w:val="en-US"/>
-        </w:rPr>
-        <w:t>) % ALPHABET_SIZE</w:t>
-      </w:r>
-    </w:p>
-    <w:p>
-      <w:pPr>
-        <w:pStyle w:val="CodeBlock"/>
-        <w:rPr>
-          <w:lang w:val="en-US"/>
-        </w:rPr>
-      </w:pPr>
-      <w:r>
-        <w:rPr>
-          <w:rFonts w:cs="Consolas"/>
-          <w:lang w:val="en-US"/>
-        </w:rPr>
-        <w:t xml:space="preserve">  if (</w:t>
-      </w:r>
-      <w:proofErr w:type="spellStart"/>
-      <w:r>
-        <w:rPr>
-          <w:rFonts w:cs="Consolas"/>
-          <w:lang w:val="en-US"/>
-        </w:rPr>
-        <w:t>newIndex</w:t>
-      </w:r>
-      <w:proofErr w:type="spellEnd"/>
-      <w:r>
-        <w:rPr>
-          <w:rFonts w:cs="Consolas"/>
-          <w:lang w:val="en-US"/>
-        </w:rPr>
-        <w:t xml:space="preserve"> &lt; 0) {</w:t>
-      </w:r>
-    </w:p>
-    <w:p>
-      <w:pPr>
-        <w:pStyle w:val="CodeBlock"/>
-        <w:rPr>
-          <w:lang w:val="en-US"/>
-        </w:rPr>
-      </w:pPr>
-      <w:r>
-        <w:rPr>
-          <w:rFonts w:cs="Consolas"/>
-          <w:lang w:val="en-US"/>
-        </w:rPr>
-        <w:t xml:space="preserve">    </w:t>
-      </w:r>
-      <w:proofErr w:type="spellStart"/>
-      <w:r>
-        <w:rPr>
-          <w:rFonts w:cs="Consolas"/>
-          <w:lang w:val="en-US"/>
-        </w:rPr>
-        <w:t>newIndex</w:t>
-      </w:r>
-      <w:proofErr w:type="spellEnd"/>
-      <w:r>
-        <w:rPr>
-          <w:rFonts w:cs="Consolas"/>
-          <w:lang w:val="en-US"/>
-        </w:rPr>
-        <w:t xml:space="preserve"> += ALPHABET_SIZE</w:t>
+      <w:r>
+        <w:rPr>
+          <w:rFonts w:cs="Consolas"/>
+          <w:lang w:val="en-US"/>
+        </w:rPr>
+        <w:t>normalizedShift = ((shift % ALPHABET_SIZE) + ALPHABET_SIZE) % ALPHABET_SIZE</w:t>
+      </w:r>
+    </w:p>
+    <w:p>
+      <w:pPr>
+        <w:pStyle w:val="CodeBlock"/>
+        <w:rPr>
+          <w:lang w:val="en-US"/>
+        </w:rPr>
+      </w:pPr>
+      <w:r>
+        <w:rPr>
+          <w:rFonts w:cs="Consolas"/>
+          <w:lang w:val="en-US"/>
+        </w:rPr>
+        <w:t xml:space="preserve">  let result = ''</w:t>
+      </w:r>
+    </w:p>
+    <w:p>
+      <w:pPr>
+        <w:pStyle w:val="CodeBlock"/>
+        <w:rPr>
+          <w:lang w:val="en-US"/>
+        </w:rPr>
+      </w:pPr>
+    </w:p>
+    <w:p>
+      <w:pPr>
+        <w:pStyle w:val="CodeBlock"/>
+        <w:rPr>
+          <w:lang w:val="en-US"/>
+        </w:rPr>
+      </w:pPr>
+      <w:r>
+        <w:rPr>
+          <w:rFonts w:cs="Consolas"/>
+          <w:lang w:val="en-US"/>
+        </w:rPr>
+        <w:t xml:space="preserve">  for (const char of text) {</w:t>
+      </w:r>
+    </w:p>
+    <w:p>
+      <w:pPr>
+        <w:pStyle w:val="CodeBlock"/>
+        <w:rPr>
+          <w:lang w:val="en-US"/>
+        </w:rPr>
+      </w:pPr>
+      <w:r>
+        <w:rPr>
+          <w:rFonts w:cs="Consolas"/>
+          <w:lang w:val="en-US"/>
+        </w:rPr>
+        <w:t xml:space="preserve">    result += shiftChar(char, normalizedShift, false)</w:t>
       </w:r>
     </w:p>
     <w:p>
@@ -2043,73 +2430,7 @@
           <w:rFonts w:cs="Consolas"/>
           <w:lang w:val="en-US"/>
         </w:rPr>
-        <w:t xml:space="preserve">  return </w:t>
-      </w:r>
-      <w:proofErr w:type="spellStart"/>
-      <w:proofErr w:type="gramStart"/>
-      <w:r>
-        <w:rPr>
-          <w:rFonts w:cs="Consolas"/>
-          <w:lang w:val="en-US"/>
-        </w:rPr>
-        <w:t>isUpper</w:t>
-      </w:r>
-      <w:proofErr w:type="spellEnd"/>
-      <w:r>
-        <w:rPr>
-          <w:rFonts w:cs="Consolas"/>
-          <w:lang w:val="en-US"/>
-        </w:rPr>
-        <w:t xml:space="preserve"> ?</w:t>
-      </w:r>
-      <w:proofErr w:type="gramEnd"/>
-      <w:r>
-        <w:rPr>
-          <w:rFonts w:cs="Consolas"/>
-          <w:lang w:val="en-US"/>
-        </w:rPr>
-        <w:t xml:space="preserve"> CYRILLIC_</w:t>
-      </w:r>
-      <w:proofErr w:type="gramStart"/>
-      <w:r>
-        <w:rPr>
-          <w:rFonts w:cs="Consolas"/>
-          <w:lang w:val="en-US"/>
-        </w:rPr>
-        <w:t>UPPER[</w:t>
-      </w:r>
-      <w:proofErr w:type="spellStart"/>
-      <w:proofErr w:type="gramEnd"/>
-      <w:r>
-        <w:rPr>
-          <w:rFonts w:cs="Consolas"/>
-          <w:lang w:val="en-US"/>
-        </w:rPr>
-        <w:t>newIndex</w:t>
-      </w:r>
-      <w:proofErr w:type="spellEnd"/>
-      <w:r>
-        <w:rPr>
-          <w:rFonts w:cs="Consolas"/>
-          <w:lang w:val="en-US"/>
-        </w:rPr>
-        <w:t>] : CYRILLIC_LOWER[</w:t>
-      </w:r>
-      <w:proofErr w:type="spellStart"/>
-      <w:r>
-        <w:rPr>
-          <w:rFonts w:cs="Consolas"/>
-          <w:lang w:val="en-US"/>
-        </w:rPr>
-        <w:t>newIndex</w:t>
-      </w:r>
-      <w:proofErr w:type="spellEnd"/>
-      <w:r>
-        <w:rPr>
-          <w:rFonts w:cs="Consolas"/>
-          <w:lang w:val="en-US"/>
-        </w:rPr>
-        <w:t>]</w:t>
+        <w:t xml:space="preserve">  return result</w:t>
       </w:r>
     </w:p>
     <w:p>
@@ -2135,7 +2456,7 @@
         </w:rPr>
       </w:pPr>
       <w:r>
-        <w:t>Функции</w:t>
+        <w:t>Валидация</w:t>
       </w:r>
       <w:r>
         <w:rPr>
@@ -2144,142 +2465,203 @@
         <w:t xml:space="preserve"> </w:t>
       </w:r>
       <w:r>
-        <w:t>шифрования</w:t>
-      </w:r>
-      <w:r>
-        <w:rPr>
+        <w:t>ключа</w:t>
+      </w:r>
+      <w:r>
+        <w:rPr>
+          <w:lang w:val="en-US"/>
+        </w:rPr>
+        <w:t>:</w:t>
+      </w:r>
+    </w:p>
+    <w:p>
+      <w:pPr>
+        <w:pStyle w:val="CodeBlock"/>
+        <w:rPr>
+          <w:lang w:val="en-US"/>
+        </w:rPr>
+      </w:pPr>
+      <w:r>
+        <w:rPr>
+          <w:rFonts w:cs="Consolas"/>
+          <w:lang w:val="en-US"/>
+        </w:rPr>
+        <w:t>export function validateShift(value: s</w:t>
+      </w:r>
+      <w:r>
+        <w:rPr>
+          <w:rFonts w:cs="Consolas"/>
+          <w:lang w:val="en-US"/>
+        </w:rPr>
+        <w:t>tring): { valid: boolean; shift: number; error?: string } {</w:t>
+      </w:r>
+    </w:p>
+    <w:p>
+      <w:pPr>
+        <w:pStyle w:val="CodeBlock"/>
+        <w:rPr>
+          <w:lang w:val="en-US"/>
+        </w:rPr>
+      </w:pPr>
+      <w:r>
+        <w:rPr>
+          <w:rFonts w:cs="Consolas"/>
+          <w:lang w:val="en-US"/>
+        </w:rPr>
+        <w:t xml:space="preserve">  const strValue = String(value || '').trim()</w:t>
+      </w:r>
+    </w:p>
+    <w:p>
+      <w:pPr>
+        <w:pStyle w:val="CodeBlock"/>
+        <w:rPr>
+          <w:lang w:val="en-US"/>
+        </w:rPr>
+      </w:pPr>
+    </w:p>
+    <w:p>
+      <w:pPr>
+        <w:pStyle w:val="CodeBlock"/>
+        <w:rPr>
+          <w:lang w:val="en-US"/>
+        </w:rPr>
+      </w:pPr>
+      <w:r>
+        <w:rPr>
+          <w:rFonts w:cs="Consolas"/>
+          <w:lang w:val="en-US"/>
+        </w:rPr>
+        <w:t xml:space="preserve">  if (strValue === '') {</w:t>
+      </w:r>
+    </w:p>
+    <w:p>
+      <w:pPr>
+        <w:pStyle w:val="CodeBlock"/>
+        <w:rPr>
+          <w:lang w:val="en-US"/>
+        </w:rPr>
+      </w:pPr>
+      <w:r>
+        <w:rPr>
+          <w:rFonts w:cs="Consolas"/>
+          <w:lang w:val="en-US"/>
+        </w:rPr>
+        <w:t xml:space="preserve">    return { valid: false, shift: 0, error: '</w:t>
+      </w:r>
+      <w:r>
+        <w:rPr>
+          <w:rFonts w:cs="Consolas"/>
+        </w:rPr>
+        <w:t>Введите</w:t>
+      </w:r>
+      <w:r>
+        <w:rPr>
+          <w:rFonts w:cs="Consolas"/>
           <w:lang w:val="en-US"/>
         </w:rPr>
         <w:t xml:space="preserve"> </w:t>
       </w:r>
       <w:r>
-        <w:t>и</w:t>
-      </w:r>
-      <w:r>
-        <w:rPr>
+        <w:rPr>
+          <w:rFonts w:cs="Consolas"/>
+        </w:rPr>
+        <w:t>значение</w:t>
+      </w:r>
+      <w:r>
+        <w:rPr>
+          <w:rFonts w:cs="Consolas"/>
           <w:lang w:val="en-US"/>
         </w:rPr>
         <w:t xml:space="preserve"> </w:t>
       </w:r>
       <w:r>
-        <w:t>дешифрования</w:t>
-      </w:r>
-      <w:r>
-        <w:rPr>
-          <w:lang w:val="en-US"/>
-        </w:rPr>
-        <w:t>:</w:t>
-      </w:r>
-    </w:p>
-    <w:p>
-      <w:pPr>
-        <w:pStyle w:val="CodeBlock"/>
-        <w:rPr>
-          <w:lang w:val="en-US"/>
-        </w:rPr>
-      </w:pPr>
-      <w:r>
-        <w:rPr>
-          <w:rFonts w:cs="Consolas"/>
-          <w:lang w:val="en-US"/>
-        </w:rPr>
-        <w:t xml:space="preserve">export function </w:t>
-      </w:r>
-      <w:proofErr w:type="spellStart"/>
-      <w:proofErr w:type="gramStart"/>
-      <w:r>
-        <w:rPr>
-          <w:rFonts w:cs="Consolas"/>
-          <w:lang w:val="en-US"/>
-        </w:rPr>
-        <w:t>encryptCaesar</w:t>
-      </w:r>
-      <w:proofErr w:type="spellEnd"/>
-      <w:r>
-        <w:rPr>
-          <w:rFonts w:cs="Consolas"/>
-          <w:lang w:val="en-US"/>
-        </w:rPr>
-        <w:t>(</w:t>
-      </w:r>
-      <w:proofErr w:type="gramEnd"/>
-      <w:r>
-        <w:rPr>
-          <w:rFonts w:cs="Consolas"/>
-          <w:lang w:val="en-US"/>
-        </w:rPr>
-        <w:t>text: string, shift: number): string {</w:t>
-      </w:r>
-    </w:p>
-    <w:p>
-      <w:pPr>
-        <w:pStyle w:val="CodeBlock"/>
-        <w:rPr>
-          <w:lang w:val="en-US"/>
-        </w:rPr>
-      </w:pPr>
-      <w:r>
-        <w:rPr>
-          <w:rFonts w:cs="Consolas"/>
-          <w:lang w:val="en-US"/>
-        </w:rPr>
-        <w:t xml:space="preserve">  if </w:t>
-      </w:r>
-      <w:proofErr w:type="gramStart"/>
-      <w:r>
-        <w:rPr>
-          <w:rFonts w:cs="Consolas"/>
-          <w:lang w:val="en-US"/>
-        </w:rPr>
-        <w:t>(!</w:t>
-      </w:r>
-      <w:proofErr w:type="spellStart"/>
-      <w:r>
-        <w:rPr>
-          <w:rFonts w:cs="Consolas"/>
-          <w:lang w:val="en-US"/>
-        </w:rPr>
-        <w:t>Number.isInteger</w:t>
-      </w:r>
-      <w:proofErr w:type="spellEnd"/>
-      <w:proofErr w:type="gramEnd"/>
-      <w:r>
-        <w:rPr>
-          <w:rFonts w:cs="Consolas"/>
-          <w:lang w:val="en-US"/>
-        </w:rPr>
-        <w:t>(shift)) {</w:t>
-      </w:r>
-    </w:p>
-    <w:p>
-      <w:pPr>
-        <w:pStyle w:val="CodeBlock"/>
-        <w:rPr>
-          <w:lang w:val="en-US"/>
-        </w:rPr>
-      </w:pPr>
-      <w:r>
-        <w:rPr>
-          <w:rFonts w:cs="Consolas"/>
-          <w:lang w:val="en-US"/>
-        </w:rPr>
-        <w:t xml:space="preserve">    throw new </w:t>
-      </w:r>
-      <w:proofErr w:type="gramStart"/>
-      <w:r>
-        <w:rPr>
-          <w:rFonts w:cs="Consolas"/>
-          <w:lang w:val="en-US"/>
-        </w:rPr>
-        <w:t>Error(</w:t>
-      </w:r>
-      <w:proofErr w:type="gramEnd"/>
-      <w:r>
-        <w:rPr>
-          <w:rFonts w:cs="Consolas"/>
-          <w:lang w:val="en-US"/>
-        </w:rPr>
-        <w:t>'</w:t>
+        <w:rPr>
+          <w:rFonts w:cs="Consolas"/>
+        </w:rPr>
+        <w:t>сдвига</w:t>
+      </w:r>
+      <w:r>
+        <w:rPr>
+          <w:rFonts w:cs="Consolas"/>
+          <w:lang w:val="en-US"/>
+        </w:rPr>
+        <w:t>' }</w:t>
+      </w:r>
+    </w:p>
+    <w:p>
+      <w:pPr>
+        <w:pStyle w:val="CodeBlock"/>
+        <w:rPr>
+          <w:lang w:val="en-US"/>
+        </w:rPr>
+      </w:pPr>
+      <w:r>
+        <w:rPr>
+          <w:rFonts w:cs="Consolas"/>
+          <w:lang w:val="en-US"/>
+        </w:rPr>
+        <w:t xml:space="preserve">  }</w:t>
+      </w:r>
+    </w:p>
+    <w:p>
+      <w:pPr>
+        <w:pStyle w:val="CodeBlock"/>
+        <w:rPr>
+          <w:lang w:val="en-US"/>
+        </w:rPr>
+      </w:pPr>
+    </w:p>
+    <w:p>
+      <w:pPr>
+        <w:pStyle w:val="CodeBlock"/>
+        <w:rPr>
+          <w:lang w:val="en-US"/>
+        </w:rPr>
+      </w:pPr>
+      <w:r>
+        <w:rPr>
+          <w:rFonts w:cs="Consolas"/>
+          <w:lang w:val="en-US"/>
+        </w:rPr>
+        <w:t xml:space="preserve">  const num = parseInt(strValue, 10)</w:t>
+      </w:r>
+    </w:p>
+    <w:p>
+      <w:pPr>
+        <w:pStyle w:val="CodeBlock"/>
+        <w:rPr>
+          <w:lang w:val="en-US"/>
+        </w:rPr>
+      </w:pPr>
+    </w:p>
+    <w:p>
+      <w:pPr>
+        <w:pStyle w:val="CodeBlock"/>
+        <w:rPr>
+          <w:lang w:val="en-US"/>
+        </w:rPr>
+      </w:pPr>
+      <w:r>
+        <w:rPr>
+          <w:rFonts w:cs="Consolas"/>
+          <w:lang w:val="en-US"/>
+        </w:rPr>
+        <w:t xml:space="preserve">  if (isNaN(num)) {</w:t>
+      </w:r>
+    </w:p>
+    <w:p>
+      <w:pPr>
+        <w:pStyle w:val="CodeBlock"/>
+        <w:rPr>
+          <w:lang w:val="en-US"/>
+        </w:rPr>
+      </w:pPr>
+      <w:r>
+        <w:rPr>
+          <w:rFonts w:cs="Consolas"/>
+          <w:lang w:val="en-US"/>
+        </w:rPr>
+        <w:t xml:space="preserve">    return { valid: false, shift: 0, error: '</w:t>
       </w:r>
       <w:r>
         <w:rPr>
@@ -2324,7 +2706,73 @@
         <w:rPr>
           <w:rFonts w:cs="Consolas"/>
         </w:rPr>
-        <w:t>целым</w:t>
+        <w:t>числом</w:t>
+      </w:r>
+      <w:r>
+        <w:rPr>
+          <w:rFonts w:cs="Consolas"/>
+          <w:lang w:val="en-US"/>
+        </w:rPr>
+        <w:t>' }</w:t>
+      </w:r>
+    </w:p>
+    <w:p>
+      <w:pPr>
+        <w:pStyle w:val="CodeBlock"/>
+        <w:rPr>
+          <w:lang w:val="en-US"/>
+        </w:rPr>
+      </w:pPr>
+      <w:r>
+        <w:rPr>
+          <w:rFonts w:cs="Consolas"/>
+          <w:lang w:val="en-US"/>
+        </w:rPr>
+        <w:t xml:space="preserve">  }</w:t>
+      </w:r>
+    </w:p>
+    <w:p>
+      <w:pPr>
+        <w:pStyle w:val="CodeBlock"/>
+        <w:rPr>
+          <w:lang w:val="en-US"/>
+        </w:rPr>
+      </w:pPr>
+    </w:p>
+    <w:p>
+      <w:pPr>
+        <w:pStyle w:val="CodeBlock"/>
+        <w:rPr>
+          <w:lang w:val="en-US"/>
+        </w:rPr>
+      </w:pPr>
+      <w:r>
+        <w:rPr>
+          <w:rFonts w:cs="Consolas"/>
+          <w:lang w:val="en-US"/>
+        </w:rPr>
+        <w:t xml:space="preserve">  if (num &lt; 0) {</w:t>
+      </w:r>
+    </w:p>
+    <w:p>
+      <w:pPr>
+        <w:pStyle w:val="CodeBlock"/>
+        <w:rPr>
+          <w:lang w:val="en-US"/>
+        </w:rPr>
+      </w:pPr>
+      <w:r>
+        <w:rPr>
+          <w:rFonts w:cs="Consolas"/>
+          <w:lang w:val="en-US"/>
+        </w:rPr>
+        <w:t xml:space="preserve">    return { valid: false, shift: 0, error: '</w:t>
+      </w:r>
+      <w:r>
+        <w:rPr>
+          <w:rFonts w:cs="Consolas"/>
+        </w:rPr>
+        <w:t>Сдвиг</w:t>
       </w:r>
       <w:r>
         <w:rPr>
@@ -2337,14 +2785,53 @@
         <w:rPr>
           <w:rFonts w:cs="Consolas"/>
         </w:rPr>
-        <w:t>числом</w:t>
-      </w:r>
-      <w:r>
-        <w:rPr>
-          <w:rFonts w:cs="Consolas"/>
-          <w:lang w:val="en-US"/>
-        </w:rPr>
-        <w:t>')</w:t>
+        <w:t>не</w:t>
+      </w:r>
+      <w:r>
+        <w:rPr>
+          <w:rFonts w:cs="Consolas"/>
+          <w:lang w:val="en-US"/>
+        </w:rPr>
+        <w:t xml:space="preserve"> </w:t>
+      </w:r>
+      <w:r>
+        <w:rPr>
+          <w:rFonts w:cs="Consolas"/>
+        </w:rPr>
+        <w:t>может</w:t>
+      </w:r>
+      <w:r>
+        <w:rPr>
+          <w:rFonts w:cs="Consolas"/>
+          <w:lang w:val="en-US"/>
+        </w:rPr>
+        <w:t xml:space="preserve"> </w:t>
+      </w:r>
+      <w:r>
+        <w:rPr>
+          <w:rFonts w:cs="Consolas"/>
+        </w:rPr>
+        <w:t>быть</w:t>
+      </w:r>
+      <w:r>
+        <w:rPr>
+          <w:rFonts w:cs="Consolas"/>
+          <w:lang w:val="en-US"/>
+        </w:rPr>
+        <w:t xml:space="preserve"> </w:t>
+      </w:r>
+      <w:r>
+        <w:rPr>
+          <w:rFonts w:cs="Consolas"/>
+        </w:rPr>
+        <w:t>отрицательным</w:t>
+      </w:r>
+      <w:r>
+        <w:rPr>
+          <w:rFonts w:cs="Consolas"/>
+          <w:lang w:val="en-US"/>
+        </w:rPr>
+        <w:t>' }</w:t>
       </w:r>
     </w:p>
     <w:p>
@@ -2382,117 +2869,94 @@
           <w:rFonts w:cs="Consolas"/>
           <w:lang w:val="en-US"/>
         </w:rPr>
-        <w:t xml:space="preserve">  const </w:t>
-      </w:r>
-      <w:proofErr w:type="spellStart"/>
-      <w:r>
-        <w:rPr>
-          <w:rFonts w:cs="Consolas"/>
-          <w:lang w:val="en-US"/>
-        </w:rPr>
-        <w:t>normalizedShift</w:t>
-      </w:r>
-      <w:proofErr w:type="spellEnd"/>
-      <w:r>
-        <w:rPr>
-          <w:rFonts w:cs="Consolas"/>
-          <w:lang w:val="en-US"/>
-        </w:rPr>
-        <w:t xml:space="preserve"> = ((shift % ALPHABET_SIZE) + ALPHABET_SIZE) % ALPHABET_SIZE</w:t>
-      </w:r>
-    </w:p>
-    <w:p>
-      <w:pPr>
-        <w:pStyle w:val="CodeBlock"/>
-        <w:rPr>
-          <w:lang w:val="en-US"/>
-        </w:rPr>
-      </w:pPr>
-      <w:r>
-        <w:rPr>
-          <w:rFonts w:cs="Consolas"/>
-          <w:lang w:val="en-US"/>
-        </w:rPr>
-        <w:t xml:space="preserve">  let result = ''</w:t>
-      </w:r>
-    </w:p>
-    <w:p>
-      <w:pPr>
-        <w:pStyle w:val="CodeBlock"/>
-        <w:rPr>
-          <w:lang w:val="en-US"/>
-        </w:rPr>
-      </w:pPr>
-    </w:p>
-    <w:p>
-      <w:pPr>
-        <w:pStyle w:val="CodeBlock"/>
-        <w:rPr>
-          <w:lang w:val="en-US"/>
-        </w:rPr>
-      </w:pPr>
-      <w:r>
-        <w:rPr>
-          <w:rFonts w:cs="Consolas"/>
-          <w:lang w:val="en-US"/>
-        </w:rPr>
-        <w:t xml:space="preserve">  for (const char of text) {</w:t>
-      </w:r>
-    </w:p>
-    <w:p>
-      <w:pPr>
-        <w:pStyle w:val="CodeBlock"/>
-        <w:rPr>
-          <w:lang w:val="en-US"/>
-        </w:rPr>
-      </w:pPr>
-      <w:r>
-        <w:rPr>
-          <w:rFonts w:cs="Consolas"/>
-          <w:lang w:val="en-US"/>
-        </w:rPr>
-        <w:t xml:space="preserve">    result += </w:t>
-      </w:r>
-      <w:proofErr w:type="spellStart"/>
-      <w:proofErr w:type="gramStart"/>
-      <w:r>
-        <w:rPr>
-          <w:rFonts w:cs="Consolas"/>
-          <w:lang w:val="en-US"/>
-        </w:rPr>
-        <w:t>shiftChar</w:t>
-      </w:r>
-      <w:proofErr w:type="spellEnd"/>
-      <w:r>
-        <w:rPr>
-          <w:rFonts w:cs="Consolas"/>
-          <w:lang w:val="en-US"/>
-        </w:rPr>
-        <w:t>(</w:t>
-      </w:r>
-      <w:proofErr w:type="gramEnd"/>
-      <w:r>
-        <w:rPr>
-          <w:rFonts w:cs="Consolas"/>
-          <w:lang w:val="en-US"/>
-        </w:rPr>
-        <w:t xml:space="preserve">char, </w:t>
-      </w:r>
-      <w:proofErr w:type="spellStart"/>
-      <w:r>
-        <w:rPr>
-          <w:rFonts w:cs="Consolas"/>
-          <w:lang w:val="en-US"/>
-        </w:rPr>
-        <w:t>normalizedShift</w:t>
-      </w:r>
-      <w:proofErr w:type="spellEnd"/>
-      <w:r>
-        <w:rPr>
-          <w:rFonts w:cs="Consolas"/>
-          <w:lang w:val="en-US"/>
-        </w:rPr>
-        <w:t>, true)</w:t>
+        <w:t xml:space="preserve">  if (num &gt; 33) {</w:t>
+      </w:r>
+    </w:p>
+    <w:p>
+      <w:pPr>
+        <w:pStyle w:val="CodeBlock"/>
+        <w:rPr>
+          <w:lang w:val="en-US"/>
+        </w:rPr>
+      </w:pPr>
+      <w:r>
+        <w:rPr>
+          <w:rFonts w:cs="Consolas"/>
+          <w:lang w:val="en-US"/>
+        </w:rPr>
+        <w:t xml:space="preserve">    return { valid: false, shift: 0,</w:t>
+      </w:r>
+      <w:r>
+        <w:rPr>
+          <w:rFonts w:cs="Consolas"/>
+          <w:lang w:val="en-US"/>
+        </w:rPr>
+        <w:t xml:space="preserve"> error: '</w:t>
+      </w:r>
+      <w:r>
+        <w:rPr>
+          <w:rFonts w:cs="Consolas"/>
+        </w:rPr>
+        <w:t>Сдвиг</w:t>
+      </w:r>
+      <w:r>
+        <w:rPr>
+          <w:rFonts w:cs="Consolas"/>
+          <w:lang w:val="en-US"/>
+        </w:rPr>
+        <w:t xml:space="preserve"> </w:t>
+      </w:r>
+      <w:r>
+        <w:rPr>
+          <w:rFonts w:cs="Consolas"/>
+        </w:rPr>
+        <w:t>не</w:t>
+      </w:r>
+      <w:r>
+        <w:rPr>
+          <w:rFonts w:cs="Consolas"/>
+          <w:lang w:val="en-US"/>
+        </w:rPr>
+        <w:t xml:space="preserve"> </w:t>
+      </w:r>
+      <w:r>
+        <w:rPr>
+          <w:rFonts w:cs="Consolas"/>
+        </w:rPr>
+        <w:t>может</w:t>
+      </w:r>
+      <w:r>
+        <w:rPr>
+          <w:rFonts w:cs="Consolas"/>
+          <w:lang w:val="en-US"/>
+        </w:rPr>
+        <w:t xml:space="preserve"> </w:t>
+      </w:r>
+      <w:r>
+        <w:rPr>
+          <w:rFonts w:cs="Consolas"/>
+        </w:rPr>
+        <w:t>быть</w:t>
+      </w:r>
+      <w:r>
+        <w:rPr>
+          <w:rFonts w:cs="Consolas"/>
+          <w:lang w:val="en-US"/>
+        </w:rPr>
+        <w:t xml:space="preserve"> </w:t>
+      </w:r>
+      <w:r>
+        <w:rPr>
+          <w:rFonts w:cs="Consolas"/>
+        </w:rPr>
+        <w:t>больше</w:t>
+      </w:r>
+      <w:r>
+        <w:rPr>
+          <w:rFonts w:cs="Consolas"/>
+          <w:lang w:val="en-US"/>
+        </w:rPr>
+        <w:t xml:space="preserve"> 33' }</w:t>
       </w:r>
     </w:p>
     <w:p>
@@ -2530,1177 +2994,26 @@
           <w:rFonts w:cs="Consolas"/>
           <w:lang w:val="en-US"/>
         </w:rPr>
-        <w:t xml:space="preserve">  return result</w:t>
-      </w:r>
-    </w:p>
-    <w:p>
-      <w:pPr>
-        <w:pStyle w:val="CodeBlock"/>
-        <w:rPr>
-          <w:lang w:val="en-US"/>
-        </w:rPr>
-      </w:pPr>
-      <w:r>
-        <w:rPr>
-          <w:rFonts w:cs="Consolas"/>
-          <w:lang w:val="en-US"/>
+        <w:t xml:space="preserve">  return { valid: true, shift: num }</w:t>
+      </w:r>
+    </w:p>
+    <w:p>
+      <w:pPr>
+        <w:pStyle w:val="CodeBlock"/>
+      </w:pPr>
+      <w:r>
+        <w:rPr>
+          <w:rFonts w:cs="Consolas"/>
         </w:rPr>
         <w:t>}</w:t>
       </w:r>
     </w:p>
     <w:p>
-      <w:pPr>
-        <w:pStyle w:val="CodeBlock"/>
-        <w:rPr>
-          <w:lang w:val="en-US"/>
-        </w:rPr>
-      </w:pPr>
-    </w:p>
-    <w:p>
-      <w:pPr>
-        <w:pStyle w:val="CodeBlock"/>
-        <w:rPr>
-          <w:lang w:val="en-US"/>
-        </w:rPr>
-      </w:pPr>
-      <w:r>
-        <w:rPr>
-          <w:rFonts w:cs="Consolas"/>
-          <w:lang w:val="en-US"/>
-        </w:rPr>
-        <w:t xml:space="preserve">export function </w:t>
-      </w:r>
-      <w:proofErr w:type="spellStart"/>
-      <w:proofErr w:type="gramStart"/>
-      <w:r>
-        <w:rPr>
-          <w:rFonts w:cs="Consolas"/>
-          <w:lang w:val="en-US"/>
-        </w:rPr>
-        <w:t>decryptCaesar</w:t>
-      </w:r>
-      <w:proofErr w:type="spellEnd"/>
-      <w:r>
-        <w:rPr>
-          <w:rFonts w:cs="Consolas"/>
-          <w:lang w:val="en-US"/>
-        </w:rPr>
-        <w:t>(</w:t>
-      </w:r>
-      <w:proofErr w:type="gramEnd"/>
-      <w:r>
-        <w:rPr>
-          <w:rFonts w:cs="Consolas"/>
-          <w:lang w:val="en-US"/>
-        </w:rPr>
-        <w:t>text: string, shift: number): string {</w:t>
-      </w:r>
-    </w:p>
-    <w:p>
-      <w:pPr>
-        <w:pStyle w:val="CodeBlock"/>
-        <w:rPr>
-          <w:lang w:val="en-US"/>
-        </w:rPr>
-      </w:pPr>
-      <w:r>
-        <w:rPr>
-          <w:rFonts w:cs="Consolas"/>
-          <w:lang w:val="en-US"/>
-        </w:rPr>
-        <w:t xml:space="preserve">  if </w:t>
-      </w:r>
-      <w:proofErr w:type="gramStart"/>
-      <w:r>
-        <w:rPr>
-          <w:rFonts w:cs="Consolas"/>
-          <w:lang w:val="en-US"/>
-        </w:rPr>
-        <w:t>(!</w:t>
-      </w:r>
-      <w:proofErr w:type="spellStart"/>
-      <w:r>
-        <w:rPr>
-          <w:rFonts w:cs="Consolas"/>
-          <w:lang w:val="en-US"/>
-        </w:rPr>
-        <w:t>Number.isInteger</w:t>
-      </w:r>
-      <w:proofErr w:type="spellEnd"/>
-      <w:proofErr w:type="gramEnd"/>
-      <w:r>
-        <w:rPr>
-          <w:rFonts w:cs="Consolas"/>
-          <w:lang w:val="en-US"/>
-        </w:rPr>
-        <w:t>(shift)) {</w:t>
-      </w:r>
-    </w:p>
-    <w:p>
-      <w:pPr>
-        <w:pStyle w:val="CodeBlock"/>
-        <w:rPr>
-          <w:lang w:val="en-US"/>
-        </w:rPr>
-      </w:pPr>
-      <w:r>
-        <w:rPr>
-          <w:rFonts w:cs="Consolas"/>
-          <w:lang w:val="en-US"/>
-        </w:rPr>
-        <w:t xml:space="preserve">    throw new </w:t>
-      </w:r>
-      <w:proofErr w:type="gramStart"/>
-      <w:r>
-        <w:rPr>
-          <w:rFonts w:cs="Consolas"/>
-          <w:lang w:val="en-US"/>
-        </w:rPr>
-        <w:t>Error(</w:t>
-      </w:r>
-      <w:proofErr w:type="gramEnd"/>
-      <w:r>
-        <w:rPr>
-          <w:rFonts w:cs="Consolas"/>
-          <w:lang w:val="en-US"/>
-        </w:rPr>
-        <w:t>'</w:t>
-      </w:r>
-      <w:r>
-        <w:rPr>
-          <w:rFonts w:cs="Consolas"/>
-        </w:rPr>
-        <w:t>Сдвиг</w:t>
-      </w:r>
-      <w:r>
-        <w:rPr>
-          <w:rFonts w:cs="Consolas"/>
-          <w:lang w:val="en-US"/>
-        </w:rPr>
-        <w:t xml:space="preserve"> </w:t>
-      </w:r>
-      <w:r>
-        <w:rPr>
-          <w:rFonts w:cs="Consolas"/>
-        </w:rPr>
-        <w:t>должен</w:t>
-      </w:r>
-      <w:r>
-        <w:rPr>
-          <w:rFonts w:cs="Consolas"/>
-          <w:lang w:val="en-US"/>
-        </w:rPr>
-        <w:t xml:space="preserve"> </w:t>
-      </w:r>
-      <w:r>
-        <w:rPr>
-          <w:rFonts w:cs="Consolas"/>
-        </w:rPr>
-        <w:t>быть</w:t>
-      </w:r>
-      <w:r>
-        <w:rPr>
-          <w:rFonts w:cs="Consolas"/>
-          <w:lang w:val="en-US"/>
-        </w:rPr>
-        <w:t xml:space="preserve"> </w:t>
-      </w:r>
-      <w:r>
-        <w:rPr>
-          <w:rFonts w:cs="Consolas"/>
-        </w:rPr>
-        <w:t>целым</w:t>
-      </w:r>
-      <w:r>
-        <w:rPr>
-          <w:rFonts w:cs="Consolas"/>
-          <w:lang w:val="en-US"/>
-        </w:rPr>
-        <w:t xml:space="preserve"> </w:t>
-      </w:r>
-      <w:r>
-        <w:rPr>
-          <w:rFonts w:cs="Consolas"/>
-        </w:rPr>
-        <w:t>числом</w:t>
-      </w:r>
-      <w:r>
-        <w:rPr>
-          <w:rFonts w:cs="Consolas"/>
-          <w:lang w:val="en-US"/>
-        </w:rPr>
-        <w:t>')</w:t>
-      </w:r>
-    </w:p>
-    <w:p>
-      <w:pPr>
-        <w:pStyle w:val="CodeBlock"/>
-        <w:rPr>
-          <w:lang w:val="en-US"/>
-        </w:rPr>
-      </w:pPr>
-      <w:r>
-        <w:rPr>
-          <w:rFonts w:cs="Consolas"/>
-          <w:lang w:val="en-US"/>
-        </w:rPr>
-        <w:t xml:space="preserve">  }</w:t>
-      </w:r>
-    </w:p>
-    <w:p>
-      <w:pPr>
-        <w:pStyle w:val="CodeBlock"/>
-        <w:rPr>
-          <w:lang w:val="en-US"/>
-        </w:rPr>
-      </w:pPr>
-    </w:p>
-    <w:p>
-      <w:pPr>
-        <w:pStyle w:val="CodeBlock"/>
-        <w:rPr>
-          <w:lang w:val="en-US"/>
-        </w:rPr>
-      </w:pPr>
-      <w:r>
-        <w:rPr>
-          <w:rFonts w:cs="Consolas"/>
-          <w:lang w:val="en-US"/>
-        </w:rPr>
-        <w:t xml:space="preserve">  const </w:t>
-      </w:r>
-      <w:proofErr w:type="spellStart"/>
-      <w:r>
-        <w:rPr>
-          <w:rFonts w:cs="Consolas"/>
-          <w:lang w:val="en-US"/>
-        </w:rPr>
-        <w:t>normalizedShift</w:t>
-      </w:r>
-      <w:proofErr w:type="spellEnd"/>
-      <w:r>
-        <w:rPr>
-          <w:rFonts w:cs="Consolas"/>
-          <w:lang w:val="en-US"/>
-        </w:rPr>
-        <w:t xml:space="preserve"> = ((shift % ALPHABET_SIZE) + ALPHABET_SIZE) % ALPHABET_SIZE</w:t>
-      </w:r>
-    </w:p>
-    <w:p>
-      <w:pPr>
-        <w:pStyle w:val="CodeBlock"/>
-        <w:rPr>
-          <w:lang w:val="en-US"/>
-        </w:rPr>
-      </w:pPr>
-      <w:r>
-        <w:rPr>
-          <w:rFonts w:cs="Consolas"/>
-          <w:lang w:val="en-US"/>
-        </w:rPr>
-        <w:t xml:space="preserve">  let result = ''</w:t>
-      </w:r>
-    </w:p>
-    <w:p>
-      <w:pPr>
-        <w:pStyle w:val="CodeBlock"/>
-        <w:rPr>
-          <w:lang w:val="en-US"/>
-        </w:rPr>
-      </w:pPr>
-    </w:p>
-    <w:p>
-      <w:pPr>
-        <w:pStyle w:val="CodeBlock"/>
-        <w:rPr>
-          <w:lang w:val="en-US"/>
-        </w:rPr>
-      </w:pPr>
-      <w:r>
-        <w:rPr>
-          <w:rFonts w:cs="Consolas"/>
-          <w:lang w:val="en-US"/>
-        </w:rPr>
-        <w:t xml:space="preserve">  for (const char of text) {</w:t>
-      </w:r>
-    </w:p>
-    <w:p>
-      <w:pPr>
-        <w:pStyle w:val="CodeBlock"/>
-        <w:rPr>
-          <w:lang w:val="en-US"/>
-        </w:rPr>
-      </w:pPr>
-      <w:r>
-        <w:rPr>
-          <w:rFonts w:cs="Consolas"/>
-          <w:lang w:val="en-US"/>
-        </w:rPr>
-        <w:t xml:space="preserve">    result += </w:t>
-      </w:r>
-      <w:proofErr w:type="spellStart"/>
-      <w:proofErr w:type="gramStart"/>
-      <w:r>
-        <w:rPr>
-          <w:rFonts w:cs="Consolas"/>
-          <w:lang w:val="en-US"/>
-        </w:rPr>
-        <w:t>shiftChar</w:t>
-      </w:r>
-      <w:proofErr w:type="spellEnd"/>
-      <w:r>
-        <w:rPr>
-          <w:rFonts w:cs="Consolas"/>
-          <w:lang w:val="en-US"/>
-        </w:rPr>
-        <w:t>(</w:t>
-      </w:r>
-      <w:proofErr w:type="gramEnd"/>
-      <w:r>
-        <w:rPr>
-          <w:rFonts w:cs="Consolas"/>
-          <w:lang w:val="en-US"/>
-        </w:rPr>
-        <w:t xml:space="preserve">char, </w:t>
-      </w:r>
-      <w:proofErr w:type="spellStart"/>
-      <w:r>
-        <w:rPr>
-          <w:rFonts w:cs="Consolas"/>
-          <w:lang w:val="en-US"/>
-        </w:rPr>
-        <w:t>normalizedShift</w:t>
-      </w:r>
-      <w:proofErr w:type="spellEnd"/>
-      <w:r>
-        <w:rPr>
-          <w:rFonts w:cs="Consolas"/>
-          <w:lang w:val="en-US"/>
-        </w:rPr>
-        <w:t>, false)</w:t>
-      </w:r>
-    </w:p>
-    <w:p>
-      <w:pPr>
-        <w:pStyle w:val="CodeBlock"/>
-        <w:rPr>
-          <w:lang w:val="en-US"/>
-        </w:rPr>
-      </w:pPr>
-      <w:r>
-        <w:rPr>
-          <w:rFonts w:cs="Consolas"/>
-          <w:lang w:val="en-US"/>
-        </w:rPr>
-        <w:t xml:space="preserve">  }</w:t>
-      </w:r>
-    </w:p>
-    <w:p>
-      <w:pPr>
-        <w:pStyle w:val="CodeBlock"/>
-        <w:rPr>
-          <w:lang w:val="en-US"/>
-        </w:rPr>
-      </w:pPr>
-    </w:p>
-    <w:p>
-      <w:pPr>
-        <w:pStyle w:val="CodeBlock"/>
-        <w:rPr>
-          <w:lang w:val="en-US"/>
-        </w:rPr>
-      </w:pPr>
-      <w:r>
-        <w:rPr>
-          <w:rFonts w:cs="Consolas"/>
-          <w:lang w:val="en-US"/>
-        </w:rPr>
-        <w:t xml:space="preserve">  return result</w:t>
-      </w:r>
-    </w:p>
-    <w:p>
-      <w:pPr>
-        <w:pStyle w:val="CodeBlock"/>
-        <w:rPr>
-          <w:lang w:val="en-US"/>
-        </w:rPr>
-      </w:pPr>
-      <w:r>
-        <w:rPr>
-          <w:rFonts w:cs="Consolas"/>
-          <w:lang w:val="en-US"/>
-        </w:rPr>
-        <w:t>}</w:t>
-      </w:r>
-    </w:p>
-    <w:p>
-      <w:pPr>
-        <w:pStyle w:val="Heading2"/>
-        <w:rPr>
-          <w:lang w:val="en-US"/>
-        </w:rPr>
-      </w:pPr>
-      <w:r>
-        <w:t>Валидация</w:t>
-      </w:r>
-      <w:r>
-        <w:rPr>
-          <w:lang w:val="en-US"/>
-        </w:rPr>
-        <w:t xml:space="preserve"> </w:t>
-      </w:r>
-      <w:r>
-        <w:t>ключа</w:t>
-      </w:r>
-      <w:r>
-        <w:rPr>
-          <w:lang w:val="en-US"/>
-        </w:rPr>
-        <w:t>:</w:t>
-      </w:r>
-    </w:p>
-    <w:p>
-      <w:pPr>
-        <w:pStyle w:val="CodeBlock"/>
-        <w:rPr>
-          <w:lang w:val="en-US"/>
-        </w:rPr>
-      </w:pPr>
-      <w:r>
-        <w:rPr>
-          <w:rFonts w:cs="Consolas"/>
-          <w:lang w:val="en-US"/>
-        </w:rPr>
-        <w:t xml:space="preserve">export function </w:t>
-      </w:r>
-      <w:proofErr w:type="spellStart"/>
-      <w:proofErr w:type="gramStart"/>
-      <w:r>
-        <w:rPr>
-          <w:rFonts w:cs="Consolas"/>
-          <w:lang w:val="en-US"/>
-        </w:rPr>
-        <w:t>validateShift</w:t>
-      </w:r>
-      <w:proofErr w:type="spellEnd"/>
-      <w:r>
-        <w:rPr>
-          <w:rFonts w:cs="Consolas"/>
-          <w:lang w:val="en-US"/>
-        </w:rPr>
-        <w:t>(</w:t>
-      </w:r>
-      <w:proofErr w:type="gramEnd"/>
-      <w:r>
-        <w:rPr>
-          <w:rFonts w:cs="Consolas"/>
-          <w:lang w:val="en-US"/>
-        </w:rPr>
-        <w:t xml:space="preserve">value: string): { valid: </w:t>
-      </w:r>
-      <w:proofErr w:type="spellStart"/>
-      <w:r>
-        <w:rPr>
-          <w:rFonts w:cs="Consolas"/>
-          <w:lang w:val="en-US"/>
-        </w:rPr>
-        <w:t>boolean</w:t>
-      </w:r>
-      <w:proofErr w:type="spellEnd"/>
-      <w:r>
-        <w:rPr>
-          <w:rFonts w:cs="Consolas"/>
-          <w:lang w:val="en-US"/>
-        </w:rPr>
-        <w:t>; shift: number; error?: string } {</w:t>
-      </w:r>
-    </w:p>
-    <w:p>
-      <w:pPr>
-        <w:pStyle w:val="CodeBlock"/>
-        <w:rPr>
-          <w:lang w:val="en-US"/>
-        </w:rPr>
-      </w:pPr>
-      <w:r>
-        <w:rPr>
-          <w:rFonts w:cs="Consolas"/>
-          <w:lang w:val="en-US"/>
-        </w:rPr>
-        <w:t xml:space="preserve">  const </w:t>
-      </w:r>
-      <w:proofErr w:type="spellStart"/>
-      <w:r>
-        <w:rPr>
-          <w:rFonts w:cs="Consolas"/>
-          <w:lang w:val="en-US"/>
-        </w:rPr>
-        <w:t>strValue</w:t>
-      </w:r>
-      <w:proofErr w:type="spellEnd"/>
-      <w:r>
-        <w:rPr>
-          <w:rFonts w:cs="Consolas"/>
-          <w:lang w:val="en-US"/>
-        </w:rPr>
-        <w:t xml:space="preserve"> = </w:t>
-      </w:r>
-      <w:proofErr w:type="gramStart"/>
-      <w:r>
-        <w:rPr>
-          <w:rFonts w:cs="Consolas"/>
-          <w:lang w:val="en-US"/>
-        </w:rPr>
-        <w:t>String(</w:t>
-      </w:r>
-      <w:proofErr w:type="gramEnd"/>
-      <w:r>
-        <w:rPr>
-          <w:rFonts w:cs="Consolas"/>
-          <w:lang w:val="en-US"/>
-        </w:rPr>
-        <w:t>value || '').trim()</w:t>
-      </w:r>
-    </w:p>
-    <w:p>
-      <w:pPr>
-        <w:pStyle w:val="CodeBlock"/>
-        <w:rPr>
-          <w:lang w:val="en-US"/>
-        </w:rPr>
-      </w:pPr>
-    </w:p>
-    <w:p>
-      <w:pPr>
-        <w:pStyle w:val="CodeBlock"/>
-        <w:rPr>
-          <w:lang w:val="en-US"/>
-        </w:rPr>
-      </w:pPr>
-      <w:r>
-        <w:rPr>
-          <w:rFonts w:cs="Consolas"/>
-          <w:lang w:val="en-US"/>
-        </w:rPr>
-        <w:t xml:space="preserve">  if (</w:t>
-      </w:r>
-      <w:proofErr w:type="spellStart"/>
-      <w:r>
-        <w:rPr>
-          <w:rFonts w:cs="Consolas"/>
-          <w:lang w:val="en-US"/>
-        </w:rPr>
-        <w:t>strValue</w:t>
-      </w:r>
-      <w:proofErr w:type="spellEnd"/>
-      <w:r>
-        <w:rPr>
-          <w:rFonts w:cs="Consolas"/>
-          <w:lang w:val="en-US"/>
-        </w:rPr>
-        <w:t xml:space="preserve"> === '') {</w:t>
-      </w:r>
-    </w:p>
-    <w:p>
-      <w:pPr>
-        <w:pStyle w:val="CodeBlock"/>
-        <w:rPr>
-          <w:lang w:val="en-US"/>
-        </w:rPr>
-      </w:pPr>
-      <w:r>
-        <w:rPr>
-          <w:rFonts w:cs="Consolas"/>
-          <w:lang w:val="en-US"/>
-        </w:rPr>
-        <w:t xml:space="preserve">    return </w:t>
-      </w:r>
-      <w:proofErr w:type="gramStart"/>
-      <w:r>
-        <w:rPr>
-          <w:rFonts w:cs="Consolas"/>
-          <w:lang w:val="en-US"/>
-        </w:rPr>
-        <w:t>{ valid</w:t>
-      </w:r>
-      <w:proofErr w:type="gramEnd"/>
-      <w:r>
-        <w:rPr>
-          <w:rFonts w:cs="Consolas"/>
-          <w:lang w:val="en-US"/>
-        </w:rPr>
-        <w:t>: false, shift: 0, error: '</w:t>
-      </w:r>
-      <w:r>
-        <w:rPr>
-          <w:rFonts w:cs="Consolas"/>
-        </w:rPr>
-        <w:t>Введите</w:t>
-      </w:r>
-      <w:r>
-        <w:rPr>
-          <w:rFonts w:cs="Consolas"/>
-          <w:lang w:val="en-US"/>
-        </w:rPr>
-        <w:t xml:space="preserve"> </w:t>
-      </w:r>
-      <w:r>
-        <w:rPr>
-          <w:rFonts w:cs="Consolas"/>
-        </w:rPr>
-        <w:t>значение</w:t>
-      </w:r>
-      <w:r>
-        <w:rPr>
-          <w:rFonts w:cs="Consolas"/>
-          <w:lang w:val="en-US"/>
-        </w:rPr>
-        <w:t xml:space="preserve"> </w:t>
-      </w:r>
-      <w:r>
-        <w:rPr>
-          <w:rFonts w:cs="Consolas"/>
-        </w:rPr>
-        <w:t>сдвига</w:t>
-      </w:r>
-      <w:r>
-        <w:rPr>
-          <w:rFonts w:cs="Consolas"/>
-          <w:lang w:val="en-US"/>
-        </w:rPr>
-        <w:t>' }</w:t>
-      </w:r>
-    </w:p>
-    <w:p>
-      <w:pPr>
-        <w:pStyle w:val="CodeBlock"/>
-        <w:rPr>
-          <w:lang w:val="en-US"/>
-        </w:rPr>
-      </w:pPr>
-      <w:r>
-        <w:rPr>
-          <w:rFonts w:cs="Consolas"/>
-          <w:lang w:val="en-US"/>
-        </w:rPr>
-        <w:t xml:space="preserve">  }</w:t>
-      </w:r>
-    </w:p>
-    <w:p>
-      <w:pPr>
-        <w:pStyle w:val="CodeBlock"/>
-        <w:rPr>
-          <w:lang w:val="en-US"/>
-        </w:rPr>
-      </w:pPr>
-    </w:p>
-    <w:p>
-      <w:pPr>
-        <w:pStyle w:val="CodeBlock"/>
-        <w:rPr>
-          <w:lang w:val="en-US"/>
-        </w:rPr>
-      </w:pPr>
-      <w:r>
-        <w:rPr>
-          <w:rFonts w:cs="Consolas"/>
-          <w:lang w:val="en-US"/>
-        </w:rPr>
-        <w:t xml:space="preserve">  const num = </w:t>
-      </w:r>
-      <w:proofErr w:type="spellStart"/>
-      <w:proofErr w:type="gramStart"/>
-      <w:r>
-        <w:rPr>
-          <w:rFonts w:cs="Consolas"/>
-          <w:lang w:val="en-US"/>
-        </w:rPr>
-        <w:t>parseInt</w:t>
-      </w:r>
-      <w:proofErr w:type="spellEnd"/>
-      <w:r>
-        <w:rPr>
-          <w:rFonts w:cs="Consolas"/>
-          <w:lang w:val="en-US"/>
-        </w:rPr>
-        <w:t>(</w:t>
-      </w:r>
-      <w:proofErr w:type="spellStart"/>
-      <w:proofErr w:type="gramEnd"/>
-      <w:r>
-        <w:rPr>
-          <w:rFonts w:cs="Consolas"/>
-          <w:lang w:val="en-US"/>
-        </w:rPr>
-        <w:t>strValue</w:t>
-      </w:r>
-      <w:proofErr w:type="spellEnd"/>
-      <w:r>
-        <w:rPr>
-          <w:rFonts w:cs="Consolas"/>
-          <w:lang w:val="en-US"/>
-        </w:rPr>
-        <w:t>, 10)</w:t>
-      </w:r>
-    </w:p>
-    <w:p>
-      <w:pPr>
-        <w:pStyle w:val="CodeBlock"/>
-        <w:rPr>
-          <w:lang w:val="en-US"/>
-        </w:rPr>
-      </w:pPr>
-    </w:p>
-    <w:p>
-      <w:pPr>
-        <w:pStyle w:val="CodeBlock"/>
-        <w:rPr>
-          <w:lang w:val="en-US"/>
-        </w:rPr>
-      </w:pPr>
-      <w:r>
-        <w:rPr>
-          <w:rFonts w:cs="Consolas"/>
-          <w:lang w:val="en-US"/>
-        </w:rPr>
-        <w:t xml:space="preserve">  if (</w:t>
-      </w:r>
-      <w:proofErr w:type="spellStart"/>
-      <w:r>
-        <w:rPr>
-          <w:rFonts w:cs="Consolas"/>
-          <w:lang w:val="en-US"/>
-        </w:rPr>
-        <w:t>isNaN</w:t>
-      </w:r>
-      <w:proofErr w:type="spellEnd"/>
-      <w:r>
-        <w:rPr>
-          <w:rFonts w:cs="Consolas"/>
-          <w:lang w:val="en-US"/>
-        </w:rPr>
-        <w:t>(num)) {</w:t>
-      </w:r>
-    </w:p>
-    <w:p>
-      <w:pPr>
-        <w:pStyle w:val="CodeBlock"/>
-        <w:rPr>
-          <w:lang w:val="en-US"/>
-        </w:rPr>
-      </w:pPr>
-      <w:r>
-        <w:rPr>
-          <w:rFonts w:cs="Consolas"/>
-          <w:lang w:val="en-US"/>
-        </w:rPr>
-        <w:t xml:space="preserve">    return </w:t>
-      </w:r>
-      <w:proofErr w:type="gramStart"/>
-      <w:r>
-        <w:rPr>
-          <w:rFonts w:cs="Consolas"/>
-          <w:lang w:val="en-US"/>
-        </w:rPr>
-        <w:t>{ valid</w:t>
-      </w:r>
-      <w:proofErr w:type="gramEnd"/>
-      <w:r>
-        <w:rPr>
-          <w:rFonts w:cs="Consolas"/>
-          <w:lang w:val="en-US"/>
-        </w:rPr>
-        <w:t>: false, shift: 0, error: '</w:t>
-      </w:r>
-      <w:r>
-        <w:rPr>
-          <w:rFonts w:cs="Consolas"/>
-        </w:rPr>
-        <w:t>Сдвиг</w:t>
-      </w:r>
-      <w:r>
-        <w:rPr>
-          <w:rFonts w:cs="Consolas"/>
-          <w:lang w:val="en-US"/>
-        </w:rPr>
-        <w:t xml:space="preserve"> </w:t>
-      </w:r>
-      <w:r>
-        <w:rPr>
-          <w:rFonts w:cs="Consolas"/>
-        </w:rPr>
-        <w:t>должен</w:t>
-      </w:r>
-      <w:r>
-        <w:rPr>
-          <w:rFonts w:cs="Consolas"/>
-          <w:lang w:val="en-US"/>
-        </w:rPr>
-        <w:t xml:space="preserve"> </w:t>
-      </w:r>
-      <w:r>
-        <w:rPr>
-          <w:rFonts w:cs="Consolas"/>
-        </w:rPr>
-        <w:t>быть</w:t>
-      </w:r>
-      <w:r>
-        <w:rPr>
-          <w:rFonts w:cs="Consolas"/>
-          <w:lang w:val="en-US"/>
-        </w:rPr>
-        <w:t xml:space="preserve"> </w:t>
-      </w:r>
-      <w:r>
-        <w:rPr>
-          <w:rFonts w:cs="Consolas"/>
-        </w:rPr>
-        <w:t>числом</w:t>
-      </w:r>
-      <w:r>
-        <w:rPr>
-          <w:rFonts w:cs="Consolas"/>
-          <w:lang w:val="en-US"/>
-        </w:rPr>
-        <w:t>' }</w:t>
-      </w:r>
-    </w:p>
-    <w:p>
-      <w:pPr>
-        <w:pStyle w:val="CodeBlock"/>
-        <w:rPr>
-          <w:lang w:val="en-US"/>
-        </w:rPr>
-      </w:pPr>
-      <w:r>
-        <w:rPr>
-          <w:rFonts w:cs="Consolas"/>
-          <w:lang w:val="en-US"/>
-        </w:rPr>
-        <w:t xml:space="preserve">  }</w:t>
-      </w:r>
-    </w:p>
-    <w:p>
-      <w:pPr>
-        <w:pStyle w:val="CodeBlock"/>
-        <w:rPr>
-          <w:lang w:val="en-US"/>
-        </w:rPr>
-      </w:pPr>
-    </w:p>
-    <w:p>
-      <w:pPr>
-        <w:pStyle w:val="CodeBlock"/>
-        <w:rPr>
-          <w:lang w:val="en-US"/>
-        </w:rPr>
-      </w:pPr>
-      <w:r>
-        <w:rPr>
-          <w:rFonts w:cs="Consolas"/>
-          <w:lang w:val="en-US"/>
-        </w:rPr>
-        <w:t xml:space="preserve">  if (num &lt; 0) {</w:t>
-      </w:r>
-    </w:p>
-    <w:p>
-      <w:pPr>
-        <w:pStyle w:val="CodeBlock"/>
-        <w:rPr>
-          <w:lang w:val="en-US"/>
-        </w:rPr>
-      </w:pPr>
-      <w:r>
-        <w:rPr>
-          <w:rFonts w:cs="Consolas"/>
-          <w:lang w:val="en-US"/>
-        </w:rPr>
-        <w:t xml:space="preserve">    return </w:t>
-      </w:r>
-      <w:proofErr w:type="gramStart"/>
-      <w:r>
-        <w:rPr>
-          <w:rFonts w:cs="Consolas"/>
-          <w:lang w:val="en-US"/>
-        </w:rPr>
-        <w:t>{ valid</w:t>
-      </w:r>
-      <w:proofErr w:type="gramEnd"/>
-      <w:r>
-        <w:rPr>
-          <w:rFonts w:cs="Consolas"/>
-          <w:lang w:val="en-US"/>
-        </w:rPr>
-        <w:t>: false, shift: 0, error: '</w:t>
-      </w:r>
-      <w:r>
-        <w:rPr>
-          <w:rFonts w:cs="Consolas"/>
-        </w:rPr>
-        <w:t>Сдвиг</w:t>
-      </w:r>
-      <w:r>
-        <w:rPr>
-          <w:rFonts w:cs="Consolas"/>
-          <w:lang w:val="en-US"/>
-        </w:rPr>
-        <w:t xml:space="preserve"> </w:t>
-      </w:r>
-      <w:r>
-        <w:rPr>
-          <w:rFonts w:cs="Consolas"/>
-        </w:rPr>
-        <w:t>не</w:t>
-      </w:r>
-      <w:r>
-        <w:rPr>
-          <w:rFonts w:cs="Consolas"/>
-          <w:lang w:val="en-US"/>
-        </w:rPr>
-        <w:t xml:space="preserve"> </w:t>
-      </w:r>
-      <w:r>
-        <w:rPr>
-          <w:rFonts w:cs="Consolas"/>
-        </w:rPr>
-        <w:t>может</w:t>
-      </w:r>
-      <w:r>
-        <w:rPr>
-          <w:rFonts w:cs="Consolas"/>
-          <w:lang w:val="en-US"/>
-        </w:rPr>
-        <w:t xml:space="preserve"> </w:t>
-      </w:r>
-      <w:r>
-        <w:rPr>
-          <w:rFonts w:cs="Consolas"/>
-        </w:rPr>
-        <w:t>быть</w:t>
-      </w:r>
-      <w:r>
-        <w:rPr>
-          <w:rFonts w:cs="Consolas"/>
-          <w:lang w:val="en-US"/>
-        </w:rPr>
-        <w:t xml:space="preserve"> </w:t>
-      </w:r>
-      <w:r>
-        <w:rPr>
-          <w:rFonts w:cs="Consolas"/>
-        </w:rPr>
-        <w:t>отрицательным</w:t>
-      </w:r>
-      <w:r>
-        <w:rPr>
-          <w:rFonts w:cs="Consolas"/>
-          <w:lang w:val="en-US"/>
-        </w:rPr>
-        <w:t>' }</w:t>
-      </w:r>
-    </w:p>
-    <w:p>
-      <w:pPr>
-        <w:pStyle w:val="CodeBlock"/>
-        <w:rPr>
-          <w:lang w:val="en-US"/>
-        </w:rPr>
-      </w:pPr>
-      <w:r>
-        <w:rPr>
-          <w:rFonts w:cs="Consolas"/>
-          <w:lang w:val="en-US"/>
-        </w:rPr>
-        <w:t xml:space="preserve">  }</w:t>
-      </w:r>
-    </w:p>
-    <w:p>
-      <w:pPr>
-        <w:pStyle w:val="CodeBlock"/>
-        <w:rPr>
-          <w:lang w:val="en-US"/>
-        </w:rPr>
-      </w:pPr>
-    </w:p>
-    <w:p>
-      <w:pPr>
-        <w:pStyle w:val="CodeBlock"/>
-        <w:rPr>
-          <w:lang w:val="en-US"/>
-        </w:rPr>
-      </w:pPr>
-      <w:r>
-        <w:rPr>
-          <w:rFonts w:cs="Consolas"/>
-          <w:lang w:val="en-US"/>
-        </w:rPr>
-        <w:t xml:space="preserve">  if (num &gt; 33) {</w:t>
-      </w:r>
-    </w:p>
-    <w:p>
-      <w:pPr>
-        <w:pStyle w:val="CodeBlock"/>
-        <w:rPr>
-          <w:lang w:val="en-US"/>
-        </w:rPr>
-      </w:pPr>
-      <w:r>
-        <w:rPr>
-          <w:rFonts w:cs="Consolas"/>
-          <w:lang w:val="en-US"/>
-        </w:rPr>
-        <w:t xml:space="preserve">    return </w:t>
-      </w:r>
-      <w:proofErr w:type="gramStart"/>
-      <w:r>
-        <w:rPr>
-          <w:rFonts w:cs="Consolas"/>
-          <w:lang w:val="en-US"/>
-        </w:rPr>
-        <w:t>{ valid</w:t>
-      </w:r>
-      <w:proofErr w:type="gramEnd"/>
-      <w:r>
-        <w:rPr>
-          <w:rFonts w:cs="Consolas"/>
-          <w:lang w:val="en-US"/>
-        </w:rPr>
-        <w:t>: false, shift: 0, error: '</w:t>
-      </w:r>
-      <w:r>
-        <w:rPr>
-          <w:rFonts w:cs="Consolas"/>
-        </w:rPr>
-        <w:t>Сдвиг</w:t>
-      </w:r>
-      <w:r>
-        <w:rPr>
-          <w:rFonts w:cs="Consolas"/>
-          <w:lang w:val="en-US"/>
-        </w:rPr>
-        <w:t xml:space="preserve"> </w:t>
-      </w:r>
-      <w:r>
-        <w:rPr>
-          <w:rFonts w:cs="Consolas"/>
-        </w:rPr>
-        <w:t>не</w:t>
-      </w:r>
-      <w:r>
-        <w:rPr>
-          <w:rFonts w:cs="Consolas"/>
-          <w:lang w:val="en-US"/>
-        </w:rPr>
-        <w:t xml:space="preserve"> </w:t>
-      </w:r>
-      <w:r>
-        <w:rPr>
-          <w:rFonts w:cs="Consolas"/>
-        </w:rPr>
-        <w:t>может</w:t>
-      </w:r>
-      <w:r>
-        <w:rPr>
-          <w:rFonts w:cs="Consolas"/>
-          <w:lang w:val="en-US"/>
-        </w:rPr>
-        <w:t xml:space="preserve"> </w:t>
-      </w:r>
-      <w:r>
-        <w:rPr>
-          <w:rFonts w:cs="Consolas"/>
-        </w:rPr>
-        <w:t>быть</w:t>
-      </w:r>
-      <w:r>
-        <w:rPr>
-          <w:rFonts w:cs="Consolas"/>
-          <w:lang w:val="en-US"/>
-        </w:rPr>
-        <w:t xml:space="preserve"> </w:t>
-      </w:r>
-      <w:r>
-        <w:rPr>
-          <w:rFonts w:cs="Consolas"/>
-        </w:rPr>
-        <w:t>больше</w:t>
-      </w:r>
-      <w:r>
-        <w:rPr>
-          <w:rFonts w:cs="Consolas"/>
-          <w:lang w:val="en-US"/>
-        </w:rPr>
-        <w:t xml:space="preserve"> 33' }</w:t>
-      </w:r>
-    </w:p>
-    <w:p>
-      <w:pPr>
-        <w:pStyle w:val="CodeBlock"/>
-        <w:rPr>
-          <w:lang w:val="en-US"/>
-        </w:rPr>
-      </w:pPr>
-      <w:r>
-        <w:rPr>
-          <w:rFonts w:cs="Consolas"/>
-          <w:lang w:val="en-US"/>
-        </w:rPr>
-        <w:t xml:space="preserve">  }</w:t>
-      </w:r>
-    </w:p>
-    <w:p>
-      <w:pPr>
-        <w:pStyle w:val="CodeBlock"/>
-        <w:rPr>
-          <w:lang w:val="en-US"/>
-        </w:rPr>
-      </w:pPr>
-    </w:p>
-    <w:p>
-      <w:pPr>
-        <w:pStyle w:val="CodeBlock"/>
-        <w:rPr>
-          <w:lang w:val="en-US"/>
-        </w:rPr>
-      </w:pPr>
-      <w:r>
-        <w:rPr>
-          <w:rFonts w:cs="Consolas"/>
-          <w:lang w:val="en-US"/>
-        </w:rPr>
-        <w:t xml:space="preserve">  return </w:t>
-      </w:r>
-      <w:proofErr w:type="gramStart"/>
-      <w:r>
-        <w:rPr>
-          <w:rFonts w:cs="Consolas"/>
-          <w:lang w:val="en-US"/>
-        </w:rPr>
-        <w:t>{ valid</w:t>
-      </w:r>
-      <w:proofErr w:type="gramEnd"/>
-      <w:r>
-        <w:rPr>
-          <w:rFonts w:cs="Consolas"/>
-          <w:lang w:val="en-US"/>
-        </w:rPr>
-        <w:t>: true, shift: num }</w:t>
-      </w:r>
-    </w:p>
-    <w:p>
-      <w:pPr>
-        <w:pStyle w:val="CodeBlock"/>
-      </w:pPr>
-      <w:r>
-        <w:rPr>
-          <w:rFonts w:cs="Consolas"/>
-        </w:rPr>
-        <w:t>}</w:t>
-      </w:r>
-    </w:p>
-    <w:p>
-      <w:r>
-        <w:t>Обработка на странице приложения реализована в файле app/pages/lab/1.vue. При нажатии на кнопку программа проверяет наличие текста, проверяет ключ, выполняет преобразование и формирует таблицу побуквенного соответствия.</w:t>
+      <w:r>
+        <w:t xml:space="preserve">Обработка на странице приложения реализована в файле app/pages/lab/1.vue. При нажатии на кнопку программа проверяет наличие текста, проверяет ключ, выполняет </w:t>
+      </w:r>
+      <w:r>
+        <w:t>преобразование и формирует таблицу побуквенного соответствия.</w:t>
       </w:r>
     </w:p>
     <w:p>
@@ -3879,12 +3192,18 @@
     </w:p>
     <w:p>
       <w:r>
-        <w:t>В ходе лабораторной работы был изучен принцип работы шифра Цезаря и реализовано веб-приложение для шифрования и дешифрования текста на русском языке. Программа корректно выполняет циклический сдвиг букв русского алфавита, сохраняет регистр символов и оставляет без изменений символы, не входящие в алфавит.</w:t>
-      </w:r>
-    </w:p>
-    <w:p>
-      <w:r>
-        <w:t>Дополнительно реализованы проверка значения ключа, отображение статистики текста, таблица алфавита и таблица побуквенного преобразования. Это позволяет не только получить результат шифрования, но и проследить ход работы алгоритма для каждого символа.</w:t>
+        <w:t>В ходе лабораторной работы был изучен принцип работы шифра Цезаря и реализовано веб-приложение для шифрования и дешифрования те</w:t>
+      </w:r>
+      <w:r>
+        <w:t>кста на русском языке. Программа корректно выполняет циклический сдвиг букв русского алфавита, сохраняет регистр символов и оставляет без изменений символы, не входящие в алфавит.</w:t>
+      </w:r>
+    </w:p>
+    <w:p>
+      <w:r>
+        <w:t>Дополнительно реализованы проверка значения ключа, отображение статистики те</w:t>
+      </w:r>
+      <w:r>
+        <w:t>кста, таблица алфавита и таблица побуквенного преобразования. Это позволяет не только получить результат шифрования, но и проследить ход работы алгоритма для каждого символа.</w:t>
       </w:r>
     </w:p>
     <w:p>
@@ -3926,7 +3245,7 @@
 </file>
 
 <file path=word/endnotes.xml><?xml version="1.0" encoding="utf-8"?>
-<w:endnotes xmlns:wpc="http://schemas.microsoft.com/office/word/2010/wordprocessingCanvas" xmlns:cx="http://schemas.microsoft.com/office/drawing/2014/chartex" xmlns:cx1="http://schemas.microsoft.com/office/drawing/2015/9/8/chartex" xmlns:cx2="http://schemas.microsoft.com/office/drawing/2015/10/21/chartex" xmlns:cx3="http://schemas.microsoft.com/office/drawing/2016/5/9/chartex" xmlns:cx4="http://schemas.microsoft.com/office/drawing/2016/5/10/chartex" xmlns:cx5="http://schemas.microsoft.com/office/drawing/2016/5/11/chartex" xmlns:cx6="http://schemas.microsoft.com/office/drawing/2016/5/12/chartex" xmlns:cx7="http://schemas.microsoft.com/office/drawing/2016/5/13/chartex" xmlns:cx8="http://schemas.microsoft.com/office/drawing/2016/5/14/chartex" xmlns:mc="http://schemas.openxmlformats.org/markup-compatibility/2006" xmlns:aink="http://schemas.microsoft.com/office/drawing/2016/ink" xmlns:am3d="http://schemas.microsoft.com/office/drawing/2017/model3d" xmlns:o="urn:schemas-microsoft-com:office:office" xmlns:oel="http://schemas.microsoft.com/office/2019/extlst" xmlns:r="http://schemas.openxmlformats.org/officeDocument/2006/relationships" xmlns:m="http://schemas.openxmlformats.org/officeDocument/2006/math" xmlns:v="urn:schemas-microsoft-com:vml" xmlns:wp14="http://schemas.microsoft.com/office/word/2010/wordprocessingDrawing" xmlns:wp="http://schemas.openxmlformats.org/drawingml/2006/wordprocessingDrawing" xmlns:w10="urn:schemas-microsoft-com:office:word" xmlns:w="http://schemas.openxmlformats.org/wordprocessingml/2006/main" xmlns:w14="http://schemas.microsoft.com/office/word/2010/wordml" xmlns:w15="http://schemas.microsoft.com/office/word/2012/wordml" xmlns:w16cex="http://schemas.microsoft.com/office/word/2018/wordml/cex" xmlns:w16cid="http://schemas.microsoft.com/office/word/2016/wordml/cid" xmlns:w16="http://schemas.microsoft.com/office/word/2018/wordml" xmlns:w16sdtdh="http://schemas.microsoft.com/office/word/2020/wordml/sdtdatahash" xmlns:w16se="http://schemas.microsoft.com/office/word/2015/wordml/symex" xmlns:wpg="http://schemas.microsoft.com/office/word/2010/wordprocessingGroup" xmlns:wpi="http://schemas.microsoft.com/office/word/2010/wordprocessingInk" xmlns:wne="http://schemas.microsoft.com/office/word/2006/wordml" xmlns:wps="http://schemas.microsoft.com/office/word/2010/wordprocessingShape" mc:Ignorable="w14 w15 w16se w16cid w16 w16cex w16sdtdh wp14">
+<w:endnotes xmlns:wpc="http://schemas.microsoft.com/office/word/2010/wordprocessingCanvas" xmlns:cx="http://schemas.microsoft.com/office/drawing/2014/chartex" xmlns:cx1="http://schemas.microsoft.com/office/drawing/2015/9/8/chartex" xmlns:cx2="http://schemas.microsoft.com/office/drawing/2015/10/21/chartex" xmlns:cx3="http://schemas.microsoft.com/office/drawing/2016/5/9/chartex" xmlns:cx4="http://schemas.microsoft.com/office/drawing/2016/5/10/chartex" xmlns:cx5="http://schemas.microsoft.com/office/drawing/2016/5/11/chartex" xmlns:cx6="http://schemas.microsoft.com/office/drawing/2016/5/12/chartex" xmlns:cx7="http://schemas.microsoft.com/office/drawing/2016/5/13/chartex" xmlns:cx8="http://schemas.microsoft.com/office/drawing/2016/5/14/chartex" xmlns:mc="http://schemas.openxmlformats.org/markup-compatibility/2006" xmlns:aink="http://schemas.microsoft.com/office/drawing/2016/ink" xmlns:am3d="http://schemas.microsoft.com/office/drawing/2017/model3d" xmlns:o="urn:schemas-microsoft-com:office:office" xmlns:r="http://schemas.openxmlformats.org/officeDocument/2006/relationships" xmlns:m="http://schemas.openxmlformats.org/officeDocument/2006/math" xmlns:v="urn:schemas-microsoft-com:vml" xmlns:wp14="http://schemas.microsoft.com/office/word/2010/wordprocessingDrawing" xmlns:wp="http://schemas.openxmlformats.org/drawingml/2006/wordprocessingDrawing" xmlns:w10="urn:schemas-microsoft-com:office:word" xmlns:w="http://schemas.openxmlformats.org/wordprocessingml/2006/main" xmlns:w14="http://schemas.microsoft.com/office/word/2010/wordml" xmlns:w15="http://schemas.microsoft.com/office/word/2012/wordml" xmlns:w16cex="http://schemas.microsoft.com/office/word/2018/wordml/cex" xmlns:w16cid="http://schemas.microsoft.com/office/word/2016/wordml/cid" xmlns:w16="http://schemas.microsoft.com/office/word/2018/wordml" xmlns:w16sdtdh="http://schemas.microsoft.com/office/word/2020/wordml/sdtdatahash" xmlns:w16se="http://schemas.microsoft.com/office/word/2015/wordml/symex" xmlns:wpg="http://schemas.microsoft.com/office/word/2010/wordprocessingGroup" xmlns:wpi="http://schemas.microsoft.com/office/word/2010/wordprocessingInk" xmlns:wne="http://schemas.microsoft.com/office/word/2006/wordml" xmlns:wps="http://schemas.microsoft.com/office/word/2010/wordprocessingShape" mc:Ignorable="w14 w15 w16se w16cid w16 w16cex w16sdtdh wp14">
   <w:endnote w:type="separator" w:id="-1">
     <w:p>
       <w:pPr>
@@ -3951,7 +3270,7 @@
 </file>
 
 <file path=word/footnotes.xml><?xml version="1.0" encoding="utf-8"?>
-<w:footnotes xmlns:wpc="http://schemas.microsoft.com/office/word/2010/wordprocessingCanvas" xmlns:cx="http://schemas.microsoft.com/office/drawing/2014/chartex" xmlns:cx1="http://schemas.microsoft.com/office/drawing/2015/9/8/chartex" xmlns:cx2="http://schemas.microsoft.com/office/drawing/2015/10/21/chartex" xmlns:cx3="http://schemas.microsoft.com/office/drawing/2016/5/9/chartex" xmlns:cx4="http://schemas.microsoft.com/office/drawing/2016/5/10/chartex" xmlns:cx5="http://schemas.microsoft.com/office/drawing/2016/5/11/chartex" xmlns:cx6="http://schemas.microsoft.com/office/drawing/2016/5/12/chartex" xmlns:cx7="http://schemas.microsoft.com/office/drawing/2016/5/13/chartex" xmlns:cx8="http://schemas.microsoft.com/office/drawing/2016/5/14/chartex" xmlns:mc="http://schemas.openxmlformats.org/markup-compatibility/2006" xmlns:aink="http://schemas.microsoft.com/office/drawing/2016/ink" xmlns:am3d="http://schemas.microsoft.com/office/drawing/2017/model3d" xmlns:o="urn:schemas-microsoft-com:office:office" xmlns:oel="http://schemas.microsoft.com/office/2019/extlst" xmlns:r="http://schemas.openxmlformats.org/officeDocument/2006/relationships" xmlns:m="http://schemas.openxmlformats.org/officeDocument/2006/math" xmlns:v="urn:schemas-microsoft-com:vml" xmlns:wp14="http://schemas.microsoft.com/office/word/2010/wordprocessingDrawing" xmlns:wp="http://schemas.openxmlformats.org/drawingml/2006/wordprocessingDrawing" xmlns:w10="urn:schemas-microsoft-com:office:word" xmlns:w="http://schemas.openxmlformats.org/wordprocessingml/2006/main" xmlns:w14="http://schemas.microsoft.com/office/word/2010/wordml" xmlns:w15="http://schemas.microsoft.com/office/word/2012/wordml" xmlns:w16cex="http://schemas.microsoft.com/office/word/2018/wordml/cex" xmlns:w16cid="http://schemas.microsoft.com/office/word/2016/wordml/cid" xmlns:w16="http://schemas.microsoft.com/office/word/2018/wordml" xmlns:w16sdtdh="http://schemas.microsoft.com/office/word/2020/wordml/sdtdatahash" xmlns:w16se="http://schemas.microsoft.com/office/word/2015/wordml/symex" xmlns:wpg="http://schemas.microsoft.com/office/word/2010/wordprocessingGroup" xmlns:wpi="http://schemas.microsoft.com/office/word/2010/wordprocessingInk" xmlns:wne="http://schemas.microsoft.com/office/word/2006/wordml" xmlns:wps="http://schemas.microsoft.com/office/word/2010/wordprocessingShape" mc:Ignorable="w14 w15 w16se w16cid w16 w16cex w16sdtdh wp14">
+<w:footnotes xmlns:wpc="http://schemas.microsoft.com/office/word/2010/wordprocessingCanvas" xmlns:cx="http://schemas.microsoft.com/office/drawing/2014/chartex" xmlns:cx1="http://schemas.microsoft.com/office/drawing/2015/9/8/chartex" xmlns:cx2="http://schemas.microsoft.com/office/drawing/2015/10/21/chartex" xmlns:cx3="http://schemas.microsoft.com/office/drawing/2016/5/9/chartex" xmlns:cx4="http://schemas.microsoft.com/office/drawing/2016/5/10/chartex" xmlns:cx5="http://schemas.microsoft.com/office/drawing/2016/5/11/chartex" xmlns:cx6="http://schemas.microsoft.com/office/drawing/2016/5/12/chartex" xmlns:cx7="http://schemas.microsoft.com/office/drawing/2016/5/13/chartex" xmlns:cx8="http://schemas.microsoft.com/office/drawing/2016/5/14/chartex" xmlns:mc="http://schemas.openxmlformats.org/markup-compatibility/2006" xmlns:aink="http://schemas.microsoft.com/office/drawing/2016/ink" xmlns:am3d="http://schemas.microsoft.com/office/drawing/2017/model3d" xmlns:o="urn:schemas-microsoft-com:office:office" xmlns:r="http://schemas.openxmlformats.org/officeDocument/2006/relationships" xmlns:m="http://schemas.openxmlformats.org/officeDocument/2006/math" xmlns:v="urn:schemas-microsoft-com:vml" xmlns:wp14="http://schemas.microsoft.com/office/word/2010/wordprocessingDrawing" xmlns:wp="http://schemas.openxmlformats.org/drawingml/2006/wordprocessingDrawing" xmlns:w10="urn:schemas-microsoft-com:office:word" xmlns:w="http://schemas.openxmlformats.org/wordprocessingml/2006/main" xmlns:w14="http://schemas.microsoft.com/office/word/2010/wordml" xmlns:w15="http://schemas.microsoft.com/office/word/2012/wordml" xmlns:w16cex="http://schemas.microsoft.com/office/word/2018/wordml/cex" xmlns:w16cid="http://schemas.microsoft.com/office/word/2016/wordml/cid" xmlns:w16="http://schemas.microsoft.com/office/word/2018/wordml" xmlns:w16sdtdh="http://schemas.microsoft.com/office/word/2020/wordml/sdtdatahash" xmlns:w16se="http://schemas.microsoft.com/office/word/2015/wordml/symex" xmlns:wpg="http://schemas.microsoft.com/office/word/2010/wordprocessingGroup" xmlns:wpi="http://schemas.microsoft.com/office/word/2010/wordprocessingInk" xmlns:wne="http://schemas.microsoft.com/office/word/2006/wordml" xmlns:wps="http://schemas.microsoft.com/office/word/2010/wordprocessingShape" mc:Ignorable="w14 w15 w16se w16cid w16 w16cex w16sdtdh wp14">
   <w:footnote w:type="separator" w:id="-1">
     <w:p>
       <w:pPr>
@@ -3976,7 +3295,7 @@
 </file>
 
 <file path=word/numbering.xml><?xml version="1.0" encoding="utf-8"?>
-<w:numbering xmlns:wpc="http://schemas.microsoft.com/office/word/2010/wordprocessingCanvas" xmlns:cx="http://schemas.microsoft.com/office/drawing/2014/chartex" xmlns:cx1="http://schemas.microsoft.com/office/drawing/2015/9/8/chartex" xmlns:cx2="http://schemas.microsoft.com/office/drawing/2015/10/21/chartex" xmlns:cx3="http://schemas.microsoft.com/office/drawing/2016/5/9/chartex" xmlns:cx4="http://schemas.microsoft.com/office/drawing/2016/5/10/chartex" xmlns:cx5="http://schemas.microsoft.com/office/drawing/2016/5/11/chartex" xmlns:cx6="http://schemas.microsoft.com/office/drawing/2016/5/12/chartex" xmlns:cx7="http://schemas.microsoft.com/office/drawing/2016/5/13/chartex" xmlns:cx8="http://schemas.microsoft.com/office/drawing/2016/5/14/chartex" xmlns:mc="http://schemas.openxmlformats.org/markup-compatibility/2006" xmlns:aink="http://schemas.microsoft.com/office/drawing/2016/ink" xmlns:am3d="http://schemas.microsoft.com/office/drawing/2017/model3d" xmlns:o="urn:schemas-microsoft-com:office:office" xmlns:oel="http://schemas.microsoft.com/office/2019/extlst" xmlns:r="http://schemas.openxmlformats.org/officeDocument/2006/relationships" xmlns:m="http://schemas.openxmlformats.org/officeDocument/2006/math" xmlns:v="urn:schemas-microsoft-com:vml" xmlns:wp14="http://schemas.microsoft.com/office/word/2010/wordprocessingDrawing" xmlns:wp="http://schemas.openxmlformats.org/drawingml/2006/wordprocessingDrawing" xmlns:w10="urn:schemas-microsoft-com:office:word" xmlns:w="http://schemas.openxmlformats.org/wordprocessingml/2006/main" xmlns:w14="http://schemas.microsoft.com/office/word/2010/wordml" xmlns:w15="http://schemas.microsoft.com/office/word/2012/wordml" xmlns:w16cex="http://schemas.microsoft.com/office/word/2018/wordml/cex" xmlns:w16cid="http://schemas.microsoft.com/office/word/2016/wordml/cid" xmlns:w16="http://schemas.microsoft.com/office/word/2018/wordml" xmlns:w16sdtdh="http://schemas.microsoft.com/office/word/2020/wordml/sdtdatahash" xmlns:w16se="http://schemas.microsoft.com/office/word/2015/wordml/symex" xmlns:wpg="http://schemas.microsoft.com/office/word/2010/wordprocessingGroup" xmlns:wpi="http://schemas.microsoft.com/office/word/2010/wordprocessingInk" xmlns:wne="http://schemas.microsoft.com/office/word/2006/wordml" xmlns:wps="http://schemas.microsoft.com/office/word/2010/wordprocessingShape" mc:Ignorable="w14 w15 w16se w16cid w16 w16cex w16sdtdh wp14">
+<w:numbering xmlns:wpc="http://schemas.microsoft.com/office/word/2010/wordprocessingCanvas" xmlns:cx="http://schemas.microsoft.com/office/drawing/2014/chartex" xmlns:cx1="http://schemas.microsoft.com/office/drawing/2015/9/8/chartex" xmlns:cx2="http://schemas.microsoft.com/office/drawing/2015/10/21/chartex" xmlns:cx3="http://schemas.microsoft.com/office/drawing/2016/5/9/chartex" xmlns:cx4="http://schemas.microsoft.com/office/drawing/2016/5/10/chartex" xmlns:cx5="http://schemas.microsoft.com/office/drawing/2016/5/11/chartex" xmlns:cx6="http://schemas.microsoft.com/office/drawing/2016/5/12/chartex" xmlns:cx7="http://schemas.microsoft.com/office/drawing/2016/5/13/chartex" xmlns:cx8="http://schemas.microsoft.com/office/drawing/2016/5/14/chartex" xmlns:mc="http://schemas.openxmlformats.org/markup-compatibility/2006" xmlns:aink="http://schemas.microsoft.com/office/drawing/2016/ink" xmlns:am3d="http://schemas.microsoft.com/office/drawing/2017/model3d" xmlns:o="urn:schemas-microsoft-com:office:office" xmlns:r="http://schemas.openxmlformats.org/officeDocument/2006/relationships" xmlns:m="http://schemas.openxmlformats.org/officeDocument/2006/math" xmlns:v="urn:schemas-microsoft-com:vml" xmlns:wp14="http://schemas.microsoft.com/office/word/2010/wordprocessingDrawing" xmlns:wp="http://schemas.openxmlformats.org/drawingml/2006/wordprocessingDrawing" xmlns:w10="urn:schemas-microsoft-com:office:word" xmlns:w="http://schemas.openxmlformats.org/wordprocessingml/2006/main" xmlns:w14="http://schemas.microsoft.com/office/word/2010/wordml" xmlns:w15="http://schemas.microsoft.com/office/word/2012/wordml" xmlns:w16cex="http://schemas.microsoft.com/office/word/2018/wordml/cex" xmlns:w16cid="http://schemas.microsoft.com/office/word/2016/wordml/cid" xmlns:w16="http://schemas.microsoft.com/office/word/2018/wordml" xmlns:w16sdtdh="http://schemas.microsoft.com/office/word/2020/wordml/sdtdatahash" xmlns:w16se="http://schemas.microsoft.com/office/word/2015/wordml/symex" xmlns:wpg="http://schemas.microsoft.com/office/word/2010/wordprocessingGroup" xmlns:wpi="http://schemas.microsoft.com/office/word/2010/wordprocessingInk" xmlns:wne="http://schemas.microsoft.com/office/word/2006/wordml" xmlns:wps="http://schemas.microsoft.com/office/word/2010/wordprocessingShape" mc:Ignorable="w14 w15 w16se w16cid w16 w16cex w16sdtdh wp14">
   <w:abstractNum w:abstractNumId="0" w15:restartNumberingAfterBreak="0">
     <w:nsid w:val="5E355EC7"/>
     <w:multiLevelType w:val="singleLevel"/>
@@ -3994,7 +3313,7 @@
       </w:rPr>
     </w:lvl>
   </w:abstractNum>
-  <w:num w:numId="1" w16cid:durableId="26758716">
+  <w:num w:numId="1">
     <w:abstractNumId w:val="0"/>
   </w:num>
 </w:numbering>

</xml_diff>